<commit_message>
Integrate corrections from Antonio
</commit_message>
<xml_diff>
--- a/abstract.docx
+++ b/abstract.docx
@@ -1,6 +1,6 @@
 
 <file path=word/document.xml><?xml version="1.0" encoding="utf-8"?>
-<w:document xmlns:wpc="http://schemas.microsoft.com/office/word/2010/wordprocessingCanvas" xmlns:cx="http://schemas.microsoft.com/office/drawing/2014/chartex" xmlns:cx1="http://schemas.microsoft.com/office/drawing/2015/9/8/chartex" xmlns:cx2="http://schemas.microsoft.com/office/drawing/2015/10/21/chartex" xmlns:cx3="http://schemas.microsoft.com/office/drawing/2016/5/9/chartex" xmlns:cx4="http://schemas.microsoft.com/office/drawing/2016/5/10/chartex" xmlns:cx5="http://schemas.microsoft.com/office/drawing/2016/5/11/chartex" xmlns:cx6="http://schemas.microsoft.com/office/drawing/2016/5/12/chartex" xmlns:cx7="http://schemas.microsoft.com/office/drawing/2016/5/13/chartex" xmlns:cx8="http://schemas.microsoft.com/office/drawing/2016/5/14/chartex" xmlns:mc="http://schemas.openxmlformats.org/markup-compatibility/2006" xmlns:aink="http://schemas.microsoft.com/office/drawing/2016/ink" xmlns:am3d="http://schemas.microsoft.com/office/drawing/2017/model3d" xmlns:o="urn:schemas-microsoft-com:office:office" xmlns:oel="http://schemas.microsoft.com/office/2019/extlst" xmlns:r="http://schemas.openxmlformats.org/officeDocument/2006/relationships" xmlns:m="http://schemas.openxmlformats.org/officeDocument/2006/math" xmlns:v="urn:schemas-microsoft-com:vml" xmlns:wp14="http://schemas.microsoft.com/office/word/2010/wordprocessingDrawing" xmlns:wp="http://schemas.openxmlformats.org/drawingml/2006/wordprocessingDrawing" xmlns:w10="urn:schemas-microsoft-com:office:word" xmlns:w="http://schemas.openxmlformats.org/wordprocessingml/2006/main" xmlns:w14="http://schemas.microsoft.com/office/word/2010/wordml" xmlns:w15="http://schemas.microsoft.com/office/word/2012/wordml" xmlns:w16cex="http://schemas.microsoft.com/office/word/2018/wordml/cex" xmlns:w16cid="http://schemas.microsoft.com/office/word/2016/wordml/cid" xmlns:w16="http://schemas.microsoft.com/office/word/2018/wordml" xmlns:w16du="http://schemas.microsoft.com/office/word/2023/wordml/word16du" xmlns:w16sdtdh="http://schemas.microsoft.com/office/word/2020/wordml/sdtdatahash" xmlns:w16sdtfl="http://schemas.microsoft.com/office/word/2024/wordml/sdtformatlock" xmlns:w16se="http://schemas.microsoft.com/office/word/2015/wordml/symex" xmlns:wpg="http://schemas.microsoft.com/office/word/2010/wordprocessingGroup" xmlns:wpi="http://schemas.microsoft.com/office/word/2010/wordprocessingInk" xmlns:wne="http://schemas.microsoft.com/office/word/2006/wordml" xmlns:wps="http://schemas.microsoft.com/office/word/2010/wordprocessingShape" mc:Ignorable="w14 w15 w16se w16cid w16 w16cex w16sdtdh w16sdtfl w16du wp14">
+<w:document xmlns:wpc="http://schemas.microsoft.com/office/word/2010/wordprocessingCanvas" xmlns:cx="http://schemas.microsoft.com/office/drawing/2014/chartex" xmlns:cx1="http://schemas.microsoft.com/office/drawing/2015/9/8/chartex" xmlns:cx2="http://schemas.microsoft.com/office/drawing/2015/10/21/chartex" xmlns:cx3="http://schemas.microsoft.com/office/drawing/2016/5/9/chartex" xmlns:cx4="http://schemas.microsoft.com/office/drawing/2016/5/10/chartex" xmlns:cx5="http://schemas.microsoft.com/office/drawing/2016/5/11/chartex" xmlns:cx6="http://schemas.microsoft.com/office/drawing/2016/5/12/chartex" xmlns:cx7="http://schemas.microsoft.com/office/drawing/2016/5/13/chartex" xmlns:cx8="http://schemas.microsoft.com/office/drawing/2016/5/14/chartex" xmlns:mc="http://schemas.openxmlformats.org/markup-compatibility/2006" xmlns:aink="http://schemas.microsoft.com/office/drawing/2016/ink" xmlns:am3d="http://schemas.microsoft.com/office/drawing/2017/model3d" xmlns:o="urn:schemas-microsoft-com:office:office" xmlns:oel="http://schemas.microsoft.com/office/2019/extlst" xmlns:r="http://schemas.openxmlformats.org/officeDocument/2006/relationships" xmlns:m="http://schemas.openxmlformats.org/officeDocument/2006/math" xmlns:v="urn:schemas-microsoft-com:vml" xmlns:wp14="http://schemas.microsoft.com/office/word/2010/wordprocessingDrawing" xmlns:wp="http://schemas.openxmlformats.org/drawingml/2006/wordprocessingDrawing" xmlns:w10="urn:schemas-microsoft-com:office:word" xmlns:w="http://schemas.openxmlformats.org/wordprocessingml/2006/main" xmlns:w14="http://schemas.microsoft.com/office/word/2010/wordml" xmlns:w15="http://schemas.microsoft.com/office/word/2012/wordml" xmlns:w16cei="http://schemas.microsoft.com/office/word/2026/wordml/cei" xmlns:w16cex="http://schemas.microsoft.com/office/word/2018/wordml/cex" xmlns:w16cid="http://schemas.microsoft.com/office/word/2016/wordml/cid" xmlns:w16="http://schemas.microsoft.com/office/word/2018/wordml" xmlns:w16du="http://schemas.microsoft.com/office/word/2023/wordml/word16du" xmlns:w16sdtdh="http://schemas.microsoft.com/office/word/2020/wordml/sdtdatahash" xmlns:w16sdtfl="http://schemas.microsoft.com/office/word/2024/wordml/sdtformatlock" xmlns:w16se="http://schemas.microsoft.com/office/word/2015/wordml/symex" xmlns:wpg="http://schemas.microsoft.com/office/word/2010/wordprocessingGroup" xmlns:wpi="http://schemas.microsoft.com/office/word/2010/wordprocessingInk" xmlns:wne="http://schemas.microsoft.com/office/word/2006/wordml" xmlns:wps="http://schemas.microsoft.com/office/word/2010/wordprocessingShape" mc:Ignorable="w14 w15 w16se w16cid w16 w16cex w16sdtdh w16sdtfl w16du wp14">
   <w:body>
     <w:p>
       <w:pPr>
@@ -36,17 +36,12 @@
         <w:jc w:val="center"/>
         <w:rPr>
           <w:del w:id="4" w:author="Antonio Ortega" w:date="2026-09-26T17:34:00Z" w16du:dateUtc="2026-09-26T15:34:00Z"/>
-          <w:rPrChange w:id="5" w:author="Antonio Ortega" w:date="2026-09-26T17:35:00Z" w16du:dateUtc="2026-09-26T15:35:00Z">
-            <w:rPr>
-              <w:del w:id="6" w:author="Antonio Ortega" w:date="2026-09-26T17:34:00Z" w16du:dateUtc="2026-09-26T15:34:00Z"/>
-            </w:rPr>
-          </w:rPrChange>
         </w:rPr>
       </w:pPr>
-      <w:ins w:id="7" w:author="Antonio Ortega" w:date="2026-09-26T17:35:00Z" w16du:dateUtc="2026-09-26T15:35:00Z">
+      <w:ins w:id="5" w:author="Antonio Ortega" w:date="2026-09-26T17:35:00Z" w16du:dateUtc="2026-09-26T15:35:00Z">
         <w:r>
           <w:rPr>
-            <w:rPrChange w:id="8" w:author="Antonio Ortega" w:date="2026-09-26T17:35:00Z" w16du:dateUtc="2026-09-26T15:35:00Z">
+            <w:rPrChange w:id="6" w:author="Antonio Ortega" w:date="2026-09-26T17:35:00Z" w16du:dateUtc="2026-09-26T15:35:00Z">
               <w:rPr>
                 <w:i/>
                 <w:iCs/>
@@ -64,7 +59,7 @@
         </w:r>
         <w:r>
           <w:rPr>
-            <w:rPrChange w:id="9" w:author="Antonio Ortega" w:date="2026-09-26T17:35:00Z" w16du:dateUtc="2026-09-26T15:35:00Z">
+            <w:rPrChange w:id="7" w:author="Antonio Ortega" w:date="2026-09-26T17:35:00Z" w16du:dateUtc="2026-09-26T15:35:00Z">
               <w:rPr>
                 <w:i/>
                 <w:iCs/>
@@ -74,7 +69,7 @@
           <w:t>: the need for identity tracking</w:t>
         </w:r>
       </w:ins>
-      <w:del w:id="10" w:author="Antonio Ortega" w:date="2026-09-26T17:34:00Z" w16du:dateUtc="2026-09-26T15:34:00Z">
+      <w:del w:id="8" w:author="Antonio Ortega" w:date="2026-09-26T17:34:00Z" w16du:dateUtc="2026-09-26T15:34:00Z">
         <w:r>
           <w:delText xml:space="preserve"> </w:delText>
         </w:r>
@@ -85,13 +80,6 @@
           <w:rStyle w:val="CommentReference"/>
           <w:sz w:val="32"/>
           <w:szCs w:val="32"/>
-          <w:rPrChange w:id="11" w:author="Antonio Ortega" w:date="2026-09-26T17:35:00Z" w16du:dateUtc="2026-09-26T15:35:00Z">
-            <w:rPr>
-              <w:rStyle w:val="CommentReference"/>
-              <w:sz w:val="32"/>
-              <w:szCs w:val="32"/>
-            </w:rPr>
-          </w:rPrChange>
         </w:rPr>
         <w:commentReference w:id="2"/>
       </w:r>
@@ -100,7 +88,7 @@
       <w:pPr>
         <w:spacing w:before="240" w:after="240"/>
         <w:rPr>
-          <w:del w:id="12" w:author="Antonio Ortega" w:date="2026-09-26T17:47:00Z" w16du:dateUtc="2026-09-26T15:47:00Z"/>
+          <w:del w:id="9" w:author="Antonio Ortega" w:date="2026-09-26T17:47:00Z" w16du:dateUtc="2026-09-26T15:47:00Z"/>
         </w:rPr>
       </w:pPr>
       <w:r>
@@ -116,198 +104,195 @@
       <w:r>
         <w:t>provides an ideal model for investigating this relationship due to</w:t>
       </w:r>
-      <w:ins w:id="13" w:author="Antonio Ortega" w:date="2026-09-26T17:41:00Z" w16du:dateUtc="2026-09-26T15:41:00Z">
+      <w:ins w:id="10" w:author="Antonio Ortega" w:date="2026-09-26T17:41:00Z" w16du:dateUtc="2026-09-26T15:41:00Z">
         <w:r>
           <w:t xml:space="preserve"> </w:t>
         </w:r>
       </w:ins>
-      <w:ins w:id="14" w:author="Antonio Ortega" w:date="2026-09-26T17:42:00Z" w16du:dateUtc="2026-09-26T15:42:00Z">
+      <w:ins w:id="11" w:author="Antonio Ortega" w:date="2026-09-26T17:42:00Z" w16du:dateUtc="2026-09-26T15:42:00Z">
         <w:r>
           <w:t xml:space="preserve">their small size, </w:t>
         </w:r>
       </w:ins>
-      <w:ins w:id="15" w:author="Antonio Ortega" w:date="2026-09-26T17:41:00Z" w16du:dateUtc="2026-09-26T15:41:00Z">
+      <w:ins w:id="12" w:author="Antonio Ortega" w:date="2026-09-26T17:41:00Z" w16du:dateUtc="2026-09-26T15:41:00Z">
         <w:r>
           <w:t>which makes studying groups</w:t>
         </w:r>
       </w:ins>
-      <w:ins w:id="16" w:author="Antonio Ortega" w:date="2026-09-26T17:42:00Z" w16du:dateUtc="2026-09-26T15:42:00Z">
+      <w:ins w:id="13" w:author="Antonio Ortega" w:date="2026-09-26T17:42:00Z" w16du:dateUtc="2026-09-26T15:42:00Z">
         <w:r>
           <w:t xml:space="preserve"> easier, and devel</w:t>
         </w:r>
       </w:ins>
-      <w:ins w:id="17" w:author="Antonio Ortega" w:date="2026-09-26T17:43:00Z" w16du:dateUtc="2026-09-26T15:43:00Z">
+      <w:ins w:id="14" w:author="Antonio Ortega" w:date="2026-09-26T17:43:00Z" w16du:dateUtc="2026-09-26T15:43:00Z">
         <w:r>
           <w:t>oped genetic toolkit, which facilitates research into which genes may be involved in such collective behaviors</w:t>
         </w:r>
       </w:ins>
-      <w:ins w:id="18" w:author="Antonio Ortega" w:date="2026-09-26T17:44:00Z" w16du:dateUtc="2026-09-26T15:44:00Z">
+      <w:ins w:id="15" w:author="Antonio Ortega" w:date="2026-09-26T17:44:00Z" w16du:dateUtc="2026-09-26T15:44:00Z">
         <w:r>
           <w:t>.</w:t>
         </w:r>
       </w:ins>
-      <w:ins w:id="19" w:author="Antonio Ortega" w:date="2026-09-26T17:41:00Z" w16du:dateUtc="2026-09-26T15:41:00Z">
+      <w:ins w:id="16" w:author="Antonio Ortega" w:date="2026-09-26T17:41:00Z" w16du:dateUtc="2026-09-26T15:41:00Z">
         <w:r>
           <w:t xml:space="preserve"> </w:t>
         </w:r>
       </w:ins>
-      <w:del w:id="20" w:author="Antonio Ortega" w:date="2026-09-26T17:36:00Z" w16du:dateUtc="2026-09-26T15:36:00Z">
+      <w:del w:id="17" w:author="Antonio Ortega" w:date="2026-09-26T17:36:00Z" w16du:dateUtc="2026-09-26T15:36:00Z">
         <w:r>
           <w:delText xml:space="preserve"> its complex social behaviours, conserved sleep patterns and a small</w:delText>
         </w:r>
-        <w:commentRangeStart w:id="21"/>
+        <w:commentRangeStart w:id="18"/>
         <w:r>
           <w:delText>, accessible nervous system</w:delText>
         </w:r>
       </w:del>
-      <w:commentRangeEnd w:id="21"/>
+      <w:commentRangeEnd w:id="18"/>
       <w:r>
         <w:rPr>
           <w:rStyle w:val="CommentReference"/>
           <w:sz w:val="22"/>
           <w:szCs w:val="22"/>
         </w:rPr>
-        <w:commentReference w:id="21"/>
+        <w:commentReference w:id="18"/>
       </w:r>
       <w:r>
         <w:t xml:space="preserve">. </w:t>
       </w:r>
-      <w:del w:id="22" w:author="Antonio Ortega" w:date="2026-09-26T17:48:00Z" w16du:dateUtc="2026-09-26T15:48:00Z">
+      <w:del w:id="19" w:author="Antonio Ortega" w:date="2026-09-26T17:48:00Z" w16du:dateUtc="2026-09-26T15:48:00Z">
         <w:r>
           <w:delText xml:space="preserve">Furthermore, sleep-wake behaviour in flies </w:delText>
         </w:r>
-        <w:commentRangeStart w:id="23"/>
+        <w:commentRangeStart w:id="20"/>
         <w:r>
           <w:delText xml:space="preserve">is highly plastic </w:delText>
         </w:r>
-        <w:commentRangeEnd w:id="23"/>
+        <w:commentRangeEnd w:id="20"/>
         <w:r>
           <w:rPr>
             <w:rStyle w:val="CommentReference"/>
             <w:sz w:val="22"/>
             <w:szCs w:val="22"/>
           </w:rPr>
-          <w:commentReference w:id="23"/>
+          <w:commentReference w:id="20"/>
         </w:r>
         <w:r>
           <w:delText>and</w:delText>
         </w:r>
       </w:del>
-      <w:del w:id="24" w:author="Antonio Ortega" w:date="2026-09-26T17:46:00Z" w16du:dateUtc="2026-09-26T15:46:00Z">
+      <w:del w:id="21" w:author="Antonio Ortega" w:date="2026-09-26T17:46:00Z" w16du:dateUtc="2026-09-26T15:46:00Z">
         <w:r>
           <w:delText xml:space="preserve"> </w:delText>
         </w:r>
-        <w:commentRangeStart w:id="25"/>
+        <w:commentRangeStart w:id="22"/>
         <w:r>
           <w:delText xml:space="preserve">influenced by both social </w:delText>
         </w:r>
-        <w:commentRangeEnd w:id="25"/>
+        <w:commentRangeEnd w:id="22"/>
         <w:r>
           <w:rPr>
             <w:rStyle w:val="CommentReference"/>
             <w:sz w:val="22"/>
             <w:szCs w:val="22"/>
           </w:rPr>
-          <w:commentReference w:id="25"/>
+          <w:commentReference w:id="22"/>
         </w:r>
         <w:r>
           <w:delText>and internal cues, and prior sleep affects subsequent waking behaviour</w:delText>
         </w:r>
       </w:del>
-      <w:del w:id="26" w:author="Antonio Ortega" w:date="2026-09-26T17:48:00Z" w16du:dateUtc="2026-09-26T15:48:00Z">
+      <w:del w:id="23" w:author="Antonio Ortega" w:date="2026-09-26T17:48:00Z" w16du:dateUtc="2026-09-26T15:48:00Z">
         <w:r>
           <w:delText>.</w:delText>
         </w:r>
       </w:del>
-      <w:ins w:id="27" w:author="Antonio Ortega" w:date="2026-09-26T17:48:00Z" w16du:dateUtc="2026-09-26T15:48:00Z">
+      <w:ins w:id="24" w:author="Antonio Ortega" w:date="2026-09-26T17:48:00Z" w16du:dateUtc="2026-09-26T15:48:00Z">
         <w:r>
           <w:t xml:space="preserve"> In this project, </w:t>
         </w:r>
       </w:ins>
-      <w:ins w:id="28" w:author="Antonio Ortega" w:date="2026-09-26T18:06:00Z" w16du:dateUtc="2026-09-26T16:06:00Z">
-        <w:r>
-          <w:t>we show how the application of</w:t>
-        </w:r>
-        <w:r>
-          <w:t xml:space="preserve"> idtracker.ai, a system deploying semi-supervised machine learning, combined with careful human supervision</w:t>
-        </w:r>
-      </w:ins>
-      <w:ins w:id="29" w:author="Antonio Ortega" w:date="2026-09-26T18:09:00Z" w16du:dateUtc="2026-09-26T16:09:00Z">
+      <w:ins w:id="25" w:author="Antonio Ortega" w:date="2026-09-26T18:06:00Z" w16du:dateUtc="2026-09-26T16:06:00Z">
+        <w:r>
+          <w:t>we show how the application of idtracker.ai, a system deploying semi-supervised machine learning, combined with careful human supervision</w:t>
+        </w:r>
+      </w:ins>
+      <w:ins w:id="26" w:author="Antonio Ortega" w:date="2026-09-26T18:09:00Z" w16du:dateUtc="2026-09-26T16:09:00Z">
         <w:r>
           <w:t>,</w:t>
         </w:r>
       </w:ins>
+      <w:ins w:id="27" w:author="Antonio Ortega" w:date="2026-09-26T18:08:00Z" w16du:dateUtc="2026-09-26T16:08:00Z">
+        <w:r>
+          <w:t xml:space="preserve"> delivered using the Computer Visi</w:t>
+        </w:r>
+      </w:ins>
+      <w:ins w:id="28" w:author="Antonio Ortega" w:date="2026-09-26T18:09:00Z" w16du:dateUtc="2026-09-26T16:09:00Z">
+        <w:r>
+          <w:t>on Annotation Tool (CVAT)</w:t>
+        </w:r>
+      </w:ins>
+      <w:ins w:id="29" w:author="Antonio Ortega" w:date="2026-09-26T18:07:00Z" w16du:dateUtc="2026-09-26T16:07:00Z">
+        <w:r>
+          <w:t xml:space="preserve">, can be used to interrogate the system and </w:t>
+        </w:r>
+      </w:ins>
       <w:ins w:id="30" w:author="Antonio Ortega" w:date="2026-09-26T18:08:00Z" w16du:dateUtc="2026-09-26T16:08:00Z">
         <w:r>
-          <w:t xml:space="preserve"> delivered using the Computer Visi</w:t>
-        </w:r>
-      </w:ins>
-      <w:ins w:id="31" w:author="Antonio Ortega" w:date="2026-09-26T18:09:00Z" w16du:dateUtc="2026-09-26T16:09:00Z">
-        <w:r>
-          <w:t>on Annotation Tool (CVAT)</w:t>
-        </w:r>
-      </w:ins>
-      <w:ins w:id="32" w:author="Antonio Ortega" w:date="2026-09-26T18:07:00Z" w16du:dateUtc="2026-09-26T16:07:00Z">
-        <w:r>
-          <w:t xml:space="preserve">, can be used to interrogate the system and </w:t>
+          <w:t>study if and</w:t>
+        </w:r>
+      </w:ins>
+      <w:ins w:id="31" w:author="Antonio Ortega" w:date="2026-09-26T18:07:00Z" w16du:dateUtc="2026-09-26T16:07:00Z">
+        <w:r>
+          <w:t xml:space="preserve"> </w:t>
+        </w:r>
+      </w:ins>
+      <w:ins w:id="32" w:author="Antonio Ortega" w:date="2026-09-26T17:49:00Z" w16du:dateUtc="2026-09-26T15:49:00Z">
+        <w:r>
+          <w:t xml:space="preserve">how flies </w:t>
         </w:r>
       </w:ins>
       <w:ins w:id="33" w:author="Antonio Ortega" w:date="2026-09-26T18:08:00Z" w16du:dateUtc="2026-09-26T16:08:00Z">
         <w:r>
-          <w:t>study if and</w:t>
-        </w:r>
-      </w:ins>
-      <w:ins w:id="34" w:author="Antonio Ortega" w:date="2026-09-26T18:07:00Z" w16du:dateUtc="2026-09-26T16:07:00Z">
-        <w:r>
-          <w:t xml:space="preserve"> </w:t>
-        </w:r>
-      </w:ins>
-      <w:ins w:id="35" w:author="Antonio Ortega" w:date="2026-09-26T17:49:00Z" w16du:dateUtc="2026-09-26T15:49:00Z">
-        <w:r>
-          <w:t xml:space="preserve">how flies </w:t>
-        </w:r>
-      </w:ins>
-      <w:ins w:id="36" w:author="Antonio Ortega" w:date="2026-09-26T18:08:00Z" w16du:dateUtc="2026-09-26T16:08:00Z">
-        <w:r>
           <w:t xml:space="preserve">socially </w:t>
         </w:r>
       </w:ins>
-      <w:ins w:id="37" w:author="Antonio Ortega" w:date="2026-09-26T17:49:00Z" w16du:dateUtc="2026-09-26T15:49:00Z">
+      <w:ins w:id="34" w:author="Antonio Ortega" w:date="2026-09-26T17:49:00Z" w16du:dateUtc="2026-09-26T15:49:00Z">
         <w:r>
           <w:t>influence each other’s sleep</w:t>
         </w:r>
       </w:ins>
-      <w:ins w:id="38" w:author="Antonio Ortega" w:date="2026-09-26T18:08:00Z" w16du:dateUtc="2026-09-26T16:08:00Z">
+      <w:ins w:id="35" w:author="Antonio Ortega" w:date="2026-09-26T18:08:00Z" w16du:dateUtc="2026-09-26T16:08:00Z">
         <w:r>
           <w:t>.</w:t>
         </w:r>
       </w:ins>
-      <w:ins w:id="39" w:author="Antonio Ortega" w:date="2026-09-26T18:09:00Z" w16du:dateUtc="2026-09-26T16:09:00Z">
+      <w:ins w:id="36" w:author="Antonio Ortega" w:date="2026-09-26T18:09:00Z" w16du:dateUtc="2026-09-26T16:09:00Z">
         <w:r>
           <w:t xml:space="preserve"> Furthermore,</w:t>
         </w:r>
       </w:ins>
-      <w:ins w:id="40" w:author="Antonio Ortega" w:date="2026-09-26T18:10:00Z" w16du:dateUtc="2026-09-26T16:10:00Z">
+      <w:ins w:id="37" w:author="Antonio Ortega" w:date="2026-09-26T18:10:00Z" w16du:dateUtc="2026-09-26T16:10:00Z">
         <w:r>
           <w:t xml:space="preserve"> the analysis of the animal’s pose provides a richer description of animal behavior, which simple centroid tracking cannot c</w:t>
         </w:r>
       </w:ins>
-      <w:ins w:id="41" w:author="Antonio Ortega" w:date="2026-09-26T18:11:00Z" w16du:dateUtc="2026-09-26T16:11:00Z">
+      <w:ins w:id="38" w:author="Antonio Ortega" w:date="2026-09-26T18:11:00Z" w16du:dateUtc="2026-09-26T16:11:00Z">
         <w:r>
           <w:t xml:space="preserve">apture, We used this descriptive wealth to </w:t>
         </w:r>
       </w:ins>
-      <w:ins w:id="42" w:author="Antonio Ortega" w:date="2026-09-26T18:12:00Z" w16du:dateUtc="2026-09-26T16:12:00Z">
+      <w:ins w:id="39" w:author="Antonio Ortega" w:date="2026-09-26T18:12:00Z" w16du:dateUtc="2026-09-26T16:12:00Z">
         <w:r>
           <w:t xml:space="preserve">assert </w:t>
         </w:r>
       </w:ins>
-      <w:ins w:id="43" w:author="Antonio Ortega" w:date="2026-09-26T18:11:00Z" w16du:dateUtc="2026-09-26T16:11:00Z">
+      <w:ins w:id="40" w:author="Antonio Ortega" w:date="2026-09-26T18:11:00Z" w16du:dateUtc="2026-09-26T16:11:00Z">
         <w:r>
           <w:t>with more accuracy</w:t>
         </w:r>
       </w:ins>
-      <w:ins w:id="44" w:author="Antonio Ortega" w:date="2026-09-26T18:12:00Z" w16du:dateUtc="2026-09-26T16:12:00Z">
+      <w:ins w:id="41" w:author="Antonio Ortega" w:date="2026-09-26T18:12:00Z" w16du:dateUtc="2026-09-26T16:12:00Z">
         <w:r>
           <w:t xml:space="preserve"> the sleep/wake state of each animal in the group, as well as to capture relevant microbehaviors and social interactions.</w:t>
         </w:r>
@@ -317,49 +302,49 @@
       <w:pPr>
         <w:spacing w:before="240" w:after="240"/>
         <w:rPr>
-          <w:del w:id="45" w:author="Antonio Ortega" w:date="2026-09-26T18:12:00Z" w16du:dateUtc="2026-09-26T16:12:00Z"/>
+          <w:del w:id="42" w:author="Antonio Ortega" w:date="2026-09-26T18:12:00Z" w16du:dateUtc="2026-09-26T16:12:00Z"/>
         </w:rPr>
       </w:pPr>
-      <w:del w:id="46" w:author="Antonio Ortega" w:date="2026-09-26T17:47:00Z" w16du:dateUtc="2026-09-26T15:47:00Z">
+      <w:del w:id="43" w:author="Antonio Ortega" w:date="2026-09-26T17:47:00Z" w16du:dateUtc="2026-09-26T15:47:00Z">
         <w:r>
           <w:delText xml:space="preserve">We are studying </w:delText>
         </w:r>
-        <w:commentRangeStart w:id="47"/>
+        <w:commentRangeStart w:id="44"/>
         <w:r>
           <w:delText xml:space="preserve">“sleep-transfer” </w:delText>
         </w:r>
-        <w:commentRangeEnd w:id="47"/>
+        <w:commentRangeEnd w:id="44"/>
         <w:r>
           <w:rPr>
             <w:rStyle w:val="CommentReference"/>
             <w:sz w:val="22"/>
             <w:szCs w:val="22"/>
           </w:rPr>
-          <w:commentReference w:id="47"/>
+          <w:commentReference w:id="44"/>
         </w:r>
         <w:r>
           <w:delText xml:space="preserve">in Drosophila, in which social interactions influence sleep patterns among group members. </w:delText>
         </w:r>
       </w:del>
-      <w:del w:id="48" w:author="Antonio Ortega" w:date="2026-09-26T18:12:00Z" w16du:dateUtc="2026-09-26T16:12:00Z">
+      <w:del w:id="45" w:author="Antonio Ortega" w:date="2026-09-26T18:12:00Z" w16du:dateUtc="2026-09-26T16:12:00Z">
         <w:r>
           <w:delText xml:space="preserve">Disruption of olfactory signalling, either through genetic mutations(e.g, </w:delText>
         </w:r>
-        <w:commentRangeStart w:id="49"/>
+        <w:commentRangeStart w:id="46"/>
         <w:r>
           <w:delText>orco23129</w:delText>
         </w:r>
       </w:del>
-      <w:commentRangeEnd w:id="49"/>
+      <w:commentRangeEnd w:id="46"/>
       <w:r>
         <w:rPr>
           <w:rStyle w:val="CommentReference"/>
           <w:sz w:val="22"/>
           <w:szCs w:val="22"/>
         </w:rPr>
-        <w:commentReference w:id="49"/>
-      </w:r>
-      <w:del w:id="50" w:author="Antonio Ortega" w:date="2026-09-26T18:12:00Z" w16du:dateUtc="2026-09-26T16:12:00Z">
+        <w:commentReference w:id="46"/>
+      </w:r>
+      <w:del w:id="47" w:author="Antonio Ortega" w:date="2026-09-26T18:12:00Z" w16du:dateUtc="2026-09-26T16:12:00Z">
         <w:r>
           <w:delText>) or loss of antennae, impairs sleep transfer and alters sleep-wake dynamics.</w:delText>
         </w:r>
@@ -369,10 +354,10 @@
       <w:pPr>
         <w:spacing w:before="240" w:after="240"/>
         <w:rPr>
-          <w:del w:id="51" w:author="Antonio Ortega" w:date="2026-09-26T18:12:00Z" w16du:dateUtc="2026-09-26T16:12:00Z"/>
+          <w:del w:id="48" w:author="Antonio Ortega" w:date="2026-09-26T18:12:00Z" w16du:dateUtc="2026-09-26T16:12:00Z"/>
         </w:rPr>
       </w:pPr>
-      <w:del w:id="52" w:author="Antonio Ortega" w:date="2026-09-26T18:12:00Z" w16du:dateUtc="2026-09-26T16:12:00Z">
+      <w:del w:id="49" w:author="Antonio Ortega" w:date="2026-09-26T18:12:00Z" w16du:dateUtc="2026-09-26T16:12:00Z">
         <w:r>
           <w:delText>To test this, we used an automated, behavioural tracking pipeline. The flies are recorded from above with a backlit infrared (850 nm) illumination and a high-resolution camera at 150 FPS. To prevent identity loss, group videos are first manually annotated using the Computer Vision Annotation Tool (CVAT) to establish a validated ground truth. We then use DeepEthogram, an automated machine learning framework, to predict behavioural states across the group. By continuously tracking individual flies, we quantify spatial proximity and interactions over time. These individual-level behaviours are mapped onto sleep-wake transitions to evaluate how social interactions influence sleep.</w:delText>
         </w:r>
@@ -382,6 +367,45 @@
       <w:pPr>
         <w:spacing w:before="240" w:after="240"/>
       </w:pPr>
+    </w:p>
+    <w:p>
+      <w:pPr>
+        <w:spacing w:before="240" w:after="240"/>
+      </w:pPr>
+      <w:r>
+        <w:t>T</w:t>
+      </w:r>
+      <w:r>
+        <w:t>his workflow links each fly's sleep patterns to the dynamics of its group, providing a framework for studying how social context shapes rest and activity.</w:t>
+      </w:r>
+      <w:r>
+        <w:t xml:space="preserve"> The</w:t>
+      </w:r>
+      <w:r>
+        <w:t xml:space="preserve"> </w:t>
+      </w:r>
+      <w:r>
+        <w:t>id</w:t>
+      </w:r>
+      <w:r>
+        <w:t>tracker</w:t>
+      </w:r>
+      <w:r>
+        <w:t>.ai</w:t>
+      </w:r>
+      <w:r>
+        <w:t xml:space="preserve"> has so far been applied to groups of up to four flies, and </w:t>
+      </w:r>
+      <w:r>
+        <w:t xml:space="preserve">for quantifying </w:t>
+      </w:r>
+      <w:r>
+        <w:t xml:space="preserve">sleep-wake transitions alongside interactions </w:t>
+      </w:r>
+      <w:r>
+        <w:lastRenderedPageBreak/>
+        <w:t>can help reveal whether contact with a groupmate changes an individual's state, with potential relevance to other species.</w:t>
+      </w:r>
     </w:p>
     <w:p/>
     <w:sectPr>
@@ -395,7 +419,7 @@
 </file>
 
 <file path=word/comments.xml><?xml version="1.0" encoding="utf-8"?>
-<w:comments xmlns:wpc="http://schemas.microsoft.com/office/word/2010/wordprocessingCanvas" xmlns:cx="http://schemas.microsoft.com/office/drawing/2014/chartex" xmlns:cx1="http://schemas.microsoft.com/office/drawing/2015/9/8/chartex" xmlns:cx2="http://schemas.microsoft.com/office/drawing/2015/10/21/chartex" xmlns:cx3="http://schemas.microsoft.com/office/drawing/2016/5/9/chartex" xmlns:cx4="http://schemas.microsoft.com/office/drawing/2016/5/10/chartex" xmlns:cx5="http://schemas.microsoft.com/office/drawing/2016/5/11/chartex" xmlns:cx6="http://schemas.microsoft.com/office/drawing/2016/5/12/chartex" xmlns:cx7="http://schemas.microsoft.com/office/drawing/2016/5/13/chartex" xmlns:cx8="http://schemas.microsoft.com/office/drawing/2016/5/14/chartex" xmlns:mc="http://schemas.openxmlformats.org/markup-compatibility/2006" xmlns:aink="http://schemas.microsoft.com/office/drawing/2016/ink" xmlns:am3d="http://schemas.microsoft.com/office/drawing/2017/model3d" xmlns:o="urn:schemas-microsoft-com:office:office" xmlns:oel="http://schemas.microsoft.com/office/2019/extlst" xmlns:r="http://schemas.openxmlformats.org/officeDocument/2006/relationships" xmlns:m="http://schemas.openxmlformats.org/officeDocument/2006/math" xmlns:v="urn:schemas-microsoft-com:vml" xmlns:wp14="http://schemas.microsoft.com/office/word/2010/wordprocessingDrawing" xmlns:wp="http://schemas.openxmlformats.org/drawingml/2006/wordprocessingDrawing" xmlns:w10="urn:schemas-microsoft-com:office:word" xmlns:w="http://schemas.openxmlformats.org/wordprocessingml/2006/main" xmlns:w14="http://schemas.microsoft.com/office/word/2010/wordml" xmlns:w15="http://schemas.microsoft.com/office/word/2012/wordml" xmlns:w16cex="http://schemas.microsoft.com/office/word/2018/wordml/cex" xmlns:w16cid="http://schemas.microsoft.com/office/word/2016/wordml/cid" xmlns:w16="http://schemas.microsoft.com/office/word/2018/wordml" xmlns:w16du="http://schemas.microsoft.com/office/word/2023/wordml/word16du" xmlns:w16sdtdh="http://schemas.microsoft.com/office/word/2020/wordml/sdtdatahash" xmlns:w16sdtfl="http://schemas.microsoft.com/office/word/2024/wordml/sdtformatlock" xmlns:w16se="http://schemas.microsoft.com/office/word/2015/wordml/symex" xmlns:wpg="http://schemas.microsoft.com/office/word/2010/wordprocessingGroup" xmlns:wpi="http://schemas.microsoft.com/office/word/2010/wordprocessingInk" xmlns:wne="http://schemas.microsoft.com/office/word/2006/wordml" xmlns:wps="http://schemas.microsoft.com/office/word/2010/wordprocessingShape" mc:Ignorable="w14 w15 w16se w16cid w16 w16cex w16sdtdh w16sdtfl w16du wp14">
+<w:comments xmlns:wpc="http://schemas.microsoft.com/office/word/2010/wordprocessingCanvas" xmlns:cx="http://schemas.microsoft.com/office/drawing/2014/chartex" xmlns:cx1="http://schemas.microsoft.com/office/drawing/2015/9/8/chartex" xmlns:cx2="http://schemas.microsoft.com/office/drawing/2015/10/21/chartex" xmlns:cx3="http://schemas.microsoft.com/office/drawing/2016/5/9/chartex" xmlns:cx4="http://schemas.microsoft.com/office/drawing/2016/5/10/chartex" xmlns:cx5="http://schemas.microsoft.com/office/drawing/2016/5/11/chartex" xmlns:cx6="http://schemas.microsoft.com/office/drawing/2016/5/12/chartex" xmlns:cx7="http://schemas.microsoft.com/office/drawing/2016/5/13/chartex" xmlns:cx8="http://schemas.microsoft.com/office/drawing/2016/5/14/chartex" xmlns:mc="http://schemas.openxmlformats.org/markup-compatibility/2006" xmlns:aink="http://schemas.microsoft.com/office/drawing/2016/ink" xmlns:am3d="http://schemas.microsoft.com/office/drawing/2017/model3d" xmlns:o="urn:schemas-microsoft-com:office:office" xmlns:oel="http://schemas.microsoft.com/office/2019/extlst" xmlns:r="http://schemas.openxmlformats.org/officeDocument/2006/relationships" xmlns:m="http://schemas.openxmlformats.org/officeDocument/2006/math" xmlns:v="urn:schemas-microsoft-com:vml" xmlns:wp14="http://schemas.microsoft.com/office/word/2010/wordprocessingDrawing" xmlns:wp="http://schemas.openxmlformats.org/drawingml/2006/wordprocessingDrawing" xmlns:w10="urn:schemas-microsoft-com:office:word" xmlns:w="http://schemas.openxmlformats.org/wordprocessingml/2006/main" xmlns:w14="http://schemas.microsoft.com/office/word/2010/wordml" xmlns:w15="http://schemas.microsoft.com/office/word/2012/wordml" xmlns:w16cei="http://schemas.microsoft.com/office/word/2026/wordml/cei" xmlns:w16cex="http://schemas.microsoft.com/office/word/2018/wordml/cex" xmlns:w16cid="http://schemas.microsoft.com/office/word/2016/wordml/cid" xmlns:w16="http://schemas.microsoft.com/office/word/2018/wordml" xmlns:w16du="http://schemas.microsoft.com/office/word/2023/wordml/word16du" xmlns:w16sdtdh="http://schemas.microsoft.com/office/word/2020/wordml/sdtdatahash" xmlns:w16sdtfl="http://schemas.microsoft.com/office/word/2024/wordml/sdtformatlock" xmlns:w16se="http://schemas.microsoft.com/office/word/2015/wordml/symex" xmlns:wpg="http://schemas.microsoft.com/office/word/2010/wordprocessingGroup" xmlns:wpi="http://schemas.microsoft.com/office/word/2010/wordprocessingInk" xmlns:wne="http://schemas.microsoft.com/office/word/2006/wordml" xmlns:wps="http://schemas.microsoft.com/office/word/2010/wordprocessingShape" mc:Ignorable="w14 w15 w16se w16cid w16 w16cex w16sdtdh w16sdtfl w16du wp14">
   <w:comment w:id="2" w:author="Antonio Ortega" w:date="2026-09-26T17:34:00Z" w:initials="AO">
     <w:p>
       <w:pPr>
@@ -412,7 +436,7 @@
       </w:r>
     </w:p>
   </w:comment>
-  <w:comment w:id="21" w:author="Antonio Ortega" w:date="2026-09-26T17:37:00Z" w:initials="AO">
+  <w:comment w:id="18" w:author="Antonio Ortega" w:date="2026-09-26T17:37:00Z" w:initials="AO">
     <w:p>
       <w:pPr>
         <w:pStyle w:val="CommentText"/>
@@ -428,7 +452,7 @@
       </w:r>
     </w:p>
   </w:comment>
-  <w:comment w:id="23" w:author="Antonio Ortega" w:date="2026-09-26T17:44:00Z" w:initials="AO">
+  <w:comment w:id="20" w:author="Antonio Ortega" w:date="2026-09-26T17:44:00Z" w:initials="AO">
     <w:p>
       <w:pPr>
         <w:pStyle w:val="CommentText"/>
@@ -444,7 +468,7 @@
       </w:r>
     </w:p>
   </w:comment>
-  <w:comment w:id="25" w:author="Antonio Ortega" w:date="2026-09-26T17:45:00Z" w:initials="AO">
+  <w:comment w:id="22" w:author="Antonio Ortega" w:date="2026-09-26T17:45:00Z" w:initials="AO">
     <w:p>
       <w:pPr>
         <w:pStyle w:val="CommentText"/>
@@ -460,7 +484,7 @@
       </w:r>
     </w:p>
   </w:comment>
-  <w:comment w:id="47" w:author="Antonio Ortega" w:date="2026-09-26T17:46:00Z" w:initials="AO">
+  <w:comment w:id="44" w:author="Antonio Ortega" w:date="2026-09-26T17:46:00Z" w:initials="AO">
     <w:p>
       <w:pPr>
         <w:pStyle w:val="CommentText"/>
@@ -476,7 +500,7 @@
       </w:r>
     </w:p>
   </w:comment>
-  <w:comment w:id="49" w:author="Antonio Ortega" w:date="2026-09-26T18:12:00Z" w:initials="AO">
+  <w:comment w:id="46" w:author="Antonio Ortega" w:date="2026-09-26T18:12:00Z" w:initials="AO">
     <w:p>
       <w:pPr>
         <w:pStyle w:val="CommentText"/>
@@ -520,7 +544,7 @@
 </file>
 
 <file path=word/commentsExtended.xml><?xml version="1.0" encoding="utf-8"?>
-<w15:commentsEx xmlns:wpc="http://schemas.microsoft.com/office/word/2010/wordprocessingCanvas" xmlns:cx="http://schemas.microsoft.com/office/drawing/2014/chartex" xmlns:cx1="http://schemas.microsoft.com/office/drawing/2015/9/8/chartex" xmlns:cx2="http://schemas.microsoft.com/office/drawing/2015/10/21/chartex" xmlns:cx3="http://schemas.microsoft.com/office/drawing/2016/5/9/chartex" xmlns:cx4="http://schemas.microsoft.com/office/drawing/2016/5/10/chartex" xmlns:cx5="http://schemas.microsoft.com/office/drawing/2016/5/11/chartex" xmlns:cx6="http://schemas.microsoft.com/office/drawing/2016/5/12/chartex" xmlns:cx7="http://schemas.microsoft.com/office/drawing/2016/5/13/chartex" xmlns:cx8="http://schemas.microsoft.com/office/drawing/2016/5/14/chartex" xmlns:mc="http://schemas.openxmlformats.org/markup-compatibility/2006" xmlns:aink="http://schemas.microsoft.com/office/drawing/2016/ink" xmlns:am3d="http://schemas.microsoft.com/office/drawing/2017/model3d" xmlns:o="urn:schemas-microsoft-com:office:office" xmlns:oel="http://schemas.microsoft.com/office/2019/extlst" xmlns:r="http://schemas.openxmlformats.org/officeDocument/2006/relationships" xmlns:m="http://schemas.openxmlformats.org/officeDocument/2006/math" xmlns:v="urn:schemas-microsoft-com:vml" xmlns:wp14="http://schemas.microsoft.com/office/word/2010/wordprocessingDrawing" xmlns:wp="http://schemas.openxmlformats.org/drawingml/2006/wordprocessingDrawing" xmlns:w10="urn:schemas-microsoft-com:office:word" xmlns:w="http://schemas.openxmlformats.org/wordprocessingml/2006/main" xmlns:w14="http://schemas.microsoft.com/office/word/2010/wordml" xmlns:w15="http://schemas.microsoft.com/office/word/2012/wordml" xmlns:w16cex="http://schemas.microsoft.com/office/word/2018/wordml/cex" xmlns:w16cid="http://schemas.microsoft.com/office/word/2016/wordml/cid" xmlns:w16="http://schemas.microsoft.com/office/word/2018/wordml" xmlns:w16du="http://schemas.microsoft.com/office/word/2023/wordml/word16du" xmlns:w16sdtdh="http://schemas.microsoft.com/office/word/2020/wordml/sdtdatahash" xmlns:w16sdtfl="http://schemas.microsoft.com/office/word/2024/wordml/sdtformatlock" xmlns:w16se="http://schemas.microsoft.com/office/word/2015/wordml/symex" xmlns:wpg="http://schemas.microsoft.com/office/word/2010/wordprocessingGroup" xmlns:wpi="http://schemas.microsoft.com/office/word/2010/wordprocessingInk" xmlns:wne="http://schemas.microsoft.com/office/word/2006/wordml" xmlns:wps="http://schemas.microsoft.com/office/word/2010/wordprocessingShape" mc:Ignorable="w14 w15 w16se w16cid w16 w16cex w16sdtdh w16sdtfl w16du wp14">
+<w15:commentsEx xmlns:wpc="http://schemas.microsoft.com/office/word/2010/wordprocessingCanvas" xmlns:cx="http://schemas.microsoft.com/office/drawing/2014/chartex" xmlns:cx1="http://schemas.microsoft.com/office/drawing/2015/9/8/chartex" xmlns:cx2="http://schemas.microsoft.com/office/drawing/2015/10/21/chartex" xmlns:cx3="http://schemas.microsoft.com/office/drawing/2016/5/9/chartex" xmlns:cx4="http://schemas.microsoft.com/office/drawing/2016/5/10/chartex" xmlns:cx5="http://schemas.microsoft.com/office/drawing/2016/5/11/chartex" xmlns:cx6="http://schemas.microsoft.com/office/drawing/2016/5/12/chartex" xmlns:cx7="http://schemas.microsoft.com/office/drawing/2016/5/13/chartex" xmlns:cx8="http://schemas.microsoft.com/office/drawing/2016/5/14/chartex" xmlns:mc="http://schemas.openxmlformats.org/markup-compatibility/2006" xmlns:aink="http://schemas.microsoft.com/office/drawing/2016/ink" xmlns:am3d="http://schemas.microsoft.com/office/drawing/2017/model3d" xmlns:o="urn:schemas-microsoft-com:office:office" xmlns:oel="http://schemas.microsoft.com/office/2019/extlst" xmlns:r="http://schemas.openxmlformats.org/officeDocument/2006/relationships" xmlns:m="http://schemas.openxmlformats.org/officeDocument/2006/math" xmlns:v="urn:schemas-microsoft-com:vml" xmlns:wp14="http://schemas.microsoft.com/office/word/2010/wordprocessingDrawing" xmlns:wp="http://schemas.openxmlformats.org/drawingml/2006/wordprocessingDrawing" xmlns:w10="urn:schemas-microsoft-com:office:word" xmlns:w="http://schemas.openxmlformats.org/wordprocessingml/2006/main" xmlns:w14="http://schemas.microsoft.com/office/word/2010/wordml" xmlns:w15="http://schemas.microsoft.com/office/word/2012/wordml" xmlns:w16cei="http://schemas.microsoft.com/office/word/2026/wordml/cei" xmlns:w16cex="http://schemas.microsoft.com/office/word/2018/wordml/cex" xmlns:w16cid="http://schemas.microsoft.com/office/word/2016/wordml/cid" xmlns:w16="http://schemas.microsoft.com/office/word/2018/wordml" xmlns:w16du="http://schemas.microsoft.com/office/word/2023/wordml/word16du" xmlns:w16sdtdh="http://schemas.microsoft.com/office/word/2020/wordml/sdtdatahash" xmlns:w16sdtfl="http://schemas.microsoft.com/office/word/2024/wordml/sdtformatlock" xmlns:w16se="http://schemas.microsoft.com/office/word/2015/wordml/symex" xmlns:wpg="http://schemas.microsoft.com/office/word/2010/wordprocessingGroup" xmlns:wpi="http://schemas.microsoft.com/office/word/2010/wordprocessingInk" xmlns:wne="http://schemas.microsoft.com/office/word/2006/wordml" xmlns:wps="http://schemas.microsoft.com/office/word/2010/wordprocessingShape" mc:Ignorable="w14 w15 w16se w16cid w16 w16cex w16sdtdh w16sdtfl w16du wp14">
   <w15:commentEx w15:paraId="42759EF0" w15:done="0"/>
   <w15:commentEx w15:paraId="3D91DF0C" w15:done="0"/>
   <w15:commentEx w15:paraId="734E6814" w15:done="0"/>
@@ -531,7 +555,7 @@
 </file>
 
 <file path=word/commentsExtensible.xml><?xml version="1.0" encoding="utf-8"?>
-<w16cex:commentsExtensible xmlns:wpc="http://schemas.microsoft.com/office/word/2010/wordprocessingCanvas" xmlns:cx="http://schemas.microsoft.com/office/drawing/2014/chartex" xmlns:cx1="http://schemas.microsoft.com/office/drawing/2015/9/8/chartex" xmlns:cx2="http://schemas.microsoft.com/office/drawing/2015/10/21/chartex" xmlns:cx3="http://schemas.microsoft.com/office/drawing/2016/5/9/chartex" xmlns:cx4="http://schemas.microsoft.com/office/drawing/2016/5/10/chartex" xmlns:cx5="http://schemas.microsoft.com/office/drawing/2016/5/11/chartex" xmlns:cx6="http://schemas.microsoft.com/office/drawing/2016/5/12/chartex" xmlns:cx7="http://schemas.microsoft.com/office/drawing/2016/5/13/chartex" xmlns:cx8="http://schemas.microsoft.com/office/drawing/2016/5/14/chartex" xmlns:cr="http://schemas.microsoft.com/office/comments/2020/reactions" xmlns:mc="http://schemas.openxmlformats.org/markup-compatibility/2006" xmlns:aink="http://schemas.microsoft.com/office/drawing/2016/ink" xmlns:am3d="http://schemas.microsoft.com/office/drawing/2017/model3d" xmlns:o="urn:schemas-microsoft-com:office:office" xmlns:oel="http://schemas.microsoft.com/office/2019/extlst" xmlns:r="http://schemas.openxmlformats.org/officeDocument/2006/relationships" xmlns:m="http://schemas.openxmlformats.org/officeDocument/2006/math" xmlns:v="urn:schemas-microsoft-com:vml" xmlns:wp14="http://schemas.microsoft.com/office/word/2010/wordprocessingDrawing" xmlns:wp="http://schemas.openxmlformats.org/drawingml/2006/wordprocessingDrawing" xmlns:w10="urn:schemas-microsoft-com:office:word" xmlns:w="http://schemas.openxmlformats.org/wordprocessingml/2006/main" xmlns:w14="http://schemas.microsoft.com/office/word/2010/wordml" xmlns:w15="http://schemas.microsoft.com/office/word/2012/wordml" xmlns:w16cex="http://schemas.microsoft.com/office/word/2018/wordml/cex" xmlns:w16cid="http://schemas.microsoft.com/office/word/2016/wordml/cid" xmlns:w16="http://schemas.microsoft.com/office/word/2018/wordml" xmlns:w16du="http://schemas.microsoft.com/office/word/2023/wordml/word16du" xmlns:w16sdtdh="http://schemas.microsoft.com/office/word/2020/wordml/sdtdatahash" xmlns:w16sdtfl="http://schemas.microsoft.com/office/word/2024/wordml/sdtformatlock" xmlns:w16se="http://schemas.microsoft.com/office/word/2015/wordml/symex" xmlns:wpg="http://schemas.microsoft.com/office/word/2010/wordprocessingGroup" xmlns:wpi="http://schemas.microsoft.com/office/word/2010/wordprocessingInk" xmlns:wne="http://schemas.microsoft.com/office/word/2006/wordml" xmlns:wps="http://schemas.microsoft.com/office/word/2010/wordprocessingShape" mc:Ignorable="w14 w15 w16se w16cid w16 w16cex w16sdtdh w16sdtfl cr w16du wp14">
+<w16cex:commentsExtensible xmlns:wpc="http://schemas.microsoft.com/office/word/2010/wordprocessingCanvas" xmlns:cx="http://schemas.microsoft.com/office/drawing/2014/chartex" xmlns:cx1="http://schemas.microsoft.com/office/drawing/2015/9/8/chartex" xmlns:cx2="http://schemas.microsoft.com/office/drawing/2015/10/21/chartex" xmlns:cx3="http://schemas.microsoft.com/office/drawing/2016/5/9/chartex" xmlns:cx4="http://schemas.microsoft.com/office/drawing/2016/5/10/chartex" xmlns:cx5="http://schemas.microsoft.com/office/drawing/2016/5/11/chartex" xmlns:cx6="http://schemas.microsoft.com/office/drawing/2016/5/12/chartex" xmlns:cx7="http://schemas.microsoft.com/office/drawing/2016/5/13/chartex" xmlns:cx8="http://schemas.microsoft.com/office/drawing/2016/5/14/chartex" xmlns:cr="http://schemas.microsoft.com/office/comments/2020/reactions" xmlns:mc="http://schemas.openxmlformats.org/markup-compatibility/2006" xmlns:aink="http://schemas.microsoft.com/office/drawing/2016/ink" xmlns:am3d="http://schemas.microsoft.com/office/drawing/2017/model3d" xmlns:o="urn:schemas-microsoft-com:office:office" xmlns:oel="http://schemas.microsoft.com/office/2019/extlst" xmlns:r="http://schemas.openxmlformats.org/officeDocument/2006/relationships" xmlns:m="http://schemas.openxmlformats.org/officeDocument/2006/math" xmlns:v="urn:schemas-microsoft-com:vml" xmlns:wp14="http://schemas.microsoft.com/office/word/2010/wordprocessingDrawing" xmlns:wp="http://schemas.openxmlformats.org/drawingml/2006/wordprocessingDrawing" xmlns:w10="urn:schemas-microsoft-com:office:word" xmlns:w="http://schemas.openxmlformats.org/wordprocessingml/2006/main" xmlns:w14="http://schemas.microsoft.com/office/word/2010/wordml" xmlns:w15="http://schemas.microsoft.com/office/word/2012/wordml" xmlns:w16cei="http://schemas.microsoft.com/office/word/2026/wordml/cei" xmlns:w16cex="http://schemas.microsoft.com/office/word/2018/wordml/cex" xmlns:w16cid="http://schemas.microsoft.com/office/word/2016/wordml/cid" xmlns:w16="http://schemas.microsoft.com/office/word/2018/wordml" xmlns:w16du="http://schemas.microsoft.com/office/word/2023/wordml/word16du" xmlns:w16sdtdh="http://schemas.microsoft.com/office/word/2020/wordml/sdtdatahash" xmlns:w16sdtfl="http://schemas.microsoft.com/office/word/2024/wordml/sdtformatlock" xmlns:w16se="http://schemas.microsoft.com/office/word/2015/wordml/symex" xmlns:wpg="http://schemas.microsoft.com/office/word/2010/wordprocessingGroup" xmlns:wpi="http://schemas.microsoft.com/office/word/2010/wordprocessingInk" xmlns:wne="http://schemas.microsoft.com/office/word/2006/wordml" xmlns:wps="http://schemas.microsoft.com/office/word/2010/wordprocessingShape" mc:Ignorable="w14 w15 w16se w16cid w16 w16cex w16sdtdh w16sdtfl cr w16du wp14">
   <w16cex:commentExtensible w16cex:durableId="7FB3E401" w16cex:dateUtc="2026-09-26T15:34:00Z"/>
   <w16cex:commentExtensible w16cex:durableId="5E005750" w16cex:dateUtc="2026-09-26T15:37:00Z"/>
   <w16cex:commentExtensible w16cex:durableId="5BC05104" w16cex:dateUtc="2026-09-26T15:44:00Z"/>
@@ -542,7 +566,7 @@
 </file>
 
 <file path=word/commentsIds.xml><?xml version="1.0" encoding="utf-8"?>
-<w16cid:commentsIds xmlns:wpc="http://schemas.microsoft.com/office/word/2010/wordprocessingCanvas" xmlns:cx="http://schemas.microsoft.com/office/drawing/2014/chartex" xmlns:cx1="http://schemas.microsoft.com/office/drawing/2015/9/8/chartex" xmlns:cx2="http://schemas.microsoft.com/office/drawing/2015/10/21/chartex" xmlns:cx3="http://schemas.microsoft.com/office/drawing/2016/5/9/chartex" xmlns:cx4="http://schemas.microsoft.com/office/drawing/2016/5/10/chartex" xmlns:cx5="http://schemas.microsoft.com/office/drawing/2016/5/11/chartex" xmlns:cx6="http://schemas.microsoft.com/office/drawing/2016/5/12/chartex" xmlns:cx7="http://schemas.microsoft.com/office/drawing/2016/5/13/chartex" xmlns:cx8="http://schemas.microsoft.com/office/drawing/2016/5/14/chartex" xmlns:mc="http://schemas.openxmlformats.org/markup-compatibility/2006" xmlns:aink="http://schemas.microsoft.com/office/drawing/2016/ink" xmlns:am3d="http://schemas.microsoft.com/office/drawing/2017/model3d" xmlns:o="urn:schemas-microsoft-com:office:office" xmlns:oel="http://schemas.microsoft.com/office/2019/extlst" xmlns:r="http://schemas.openxmlformats.org/officeDocument/2006/relationships" xmlns:m="http://schemas.openxmlformats.org/officeDocument/2006/math" xmlns:v="urn:schemas-microsoft-com:vml" xmlns:wp14="http://schemas.microsoft.com/office/word/2010/wordprocessingDrawing" xmlns:wp="http://schemas.openxmlformats.org/drawingml/2006/wordprocessingDrawing" xmlns:w10="urn:schemas-microsoft-com:office:word" xmlns:w="http://schemas.openxmlformats.org/wordprocessingml/2006/main" xmlns:w14="http://schemas.microsoft.com/office/word/2010/wordml" xmlns:w15="http://schemas.microsoft.com/office/word/2012/wordml" xmlns:w16cex="http://schemas.microsoft.com/office/word/2018/wordml/cex" xmlns:w16cid="http://schemas.microsoft.com/office/word/2016/wordml/cid" xmlns:w16="http://schemas.microsoft.com/office/word/2018/wordml" xmlns:w16du="http://schemas.microsoft.com/office/word/2023/wordml/word16du" xmlns:w16sdtdh="http://schemas.microsoft.com/office/word/2020/wordml/sdtdatahash" xmlns:w16sdtfl="http://schemas.microsoft.com/office/word/2024/wordml/sdtformatlock" xmlns:w16se="http://schemas.microsoft.com/office/word/2015/wordml/symex" xmlns:wpg="http://schemas.microsoft.com/office/word/2010/wordprocessingGroup" xmlns:wpi="http://schemas.microsoft.com/office/word/2010/wordprocessingInk" xmlns:wne="http://schemas.microsoft.com/office/word/2006/wordml" xmlns:wps="http://schemas.microsoft.com/office/word/2010/wordprocessingShape" mc:Ignorable="w14 w15 w16se w16cid w16 w16cex w16sdtdh w16sdtfl w16du wp14">
+<w16cid:commentsIds xmlns:wpc="http://schemas.microsoft.com/office/word/2010/wordprocessingCanvas" xmlns:cx="http://schemas.microsoft.com/office/drawing/2014/chartex" xmlns:cx1="http://schemas.microsoft.com/office/drawing/2015/9/8/chartex" xmlns:cx2="http://schemas.microsoft.com/office/drawing/2015/10/21/chartex" xmlns:cx3="http://schemas.microsoft.com/office/drawing/2016/5/9/chartex" xmlns:cx4="http://schemas.microsoft.com/office/drawing/2016/5/10/chartex" xmlns:cx5="http://schemas.microsoft.com/office/drawing/2016/5/11/chartex" xmlns:cx6="http://schemas.microsoft.com/office/drawing/2016/5/12/chartex" xmlns:cx7="http://schemas.microsoft.com/office/drawing/2016/5/13/chartex" xmlns:cx8="http://schemas.microsoft.com/office/drawing/2016/5/14/chartex" xmlns:mc="http://schemas.openxmlformats.org/markup-compatibility/2006" xmlns:aink="http://schemas.microsoft.com/office/drawing/2016/ink" xmlns:am3d="http://schemas.microsoft.com/office/drawing/2017/model3d" xmlns:o="urn:schemas-microsoft-com:office:office" xmlns:oel="http://schemas.microsoft.com/office/2019/extlst" xmlns:r="http://schemas.openxmlformats.org/officeDocument/2006/relationships" xmlns:m="http://schemas.openxmlformats.org/officeDocument/2006/math" xmlns:v="urn:schemas-microsoft-com:vml" xmlns:wp14="http://schemas.microsoft.com/office/word/2010/wordprocessingDrawing" xmlns:wp="http://schemas.openxmlformats.org/drawingml/2006/wordprocessingDrawing" xmlns:w10="urn:schemas-microsoft-com:office:word" xmlns:w="http://schemas.openxmlformats.org/wordprocessingml/2006/main" xmlns:w14="http://schemas.microsoft.com/office/word/2010/wordml" xmlns:w15="http://schemas.microsoft.com/office/word/2012/wordml" xmlns:w16cei="http://schemas.microsoft.com/office/word/2026/wordml/cei" xmlns:w16cex="http://schemas.microsoft.com/office/word/2018/wordml/cex" xmlns:w16cid="http://schemas.microsoft.com/office/word/2016/wordml/cid" xmlns:w16="http://schemas.microsoft.com/office/word/2018/wordml" xmlns:w16du="http://schemas.microsoft.com/office/word/2023/wordml/word16du" xmlns:w16sdtdh="http://schemas.microsoft.com/office/word/2020/wordml/sdtdatahash" xmlns:w16sdtfl="http://schemas.microsoft.com/office/word/2024/wordml/sdtformatlock" xmlns:w16se="http://schemas.microsoft.com/office/word/2015/wordml/symex" xmlns:wpg="http://schemas.microsoft.com/office/word/2010/wordprocessingGroup" xmlns:wpi="http://schemas.microsoft.com/office/word/2010/wordprocessingInk" xmlns:wne="http://schemas.microsoft.com/office/word/2006/wordml" xmlns:wps="http://schemas.microsoft.com/office/word/2010/wordprocessingShape" mc:Ignorable="w14 w15 w16se w16cid w16 w16cex w16sdtdh w16sdtfl w16du wp14">
   <w16cid:commentId w16cid:paraId="42759EF0" w16cid:durableId="7FB3E401"/>
   <w16cid:commentId w16cid:paraId="3D91DF0C" w16cid:durableId="5E005750"/>
   <w16cid:commentId w16cid:paraId="734E6814" w16cid:durableId="5BC05104"/>
@@ -553,7 +577,7 @@
 </file>
 
 <file path=word/people.xml><?xml version="1.0" encoding="utf-8"?>
-<w15:people xmlns:wpc="http://schemas.microsoft.com/office/word/2010/wordprocessingCanvas" xmlns:cx="http://schemas.microsoft.com/office/drawing/2014/chartex" xmlns:cx1="http://schemas.microsoft.com/office/drawing/2015/9/8/chartex" xmlns:cx2="http://schemas.microsoft.com/office/drawing/2015/10/21/chartex" xmlns:cx3="http://schemas.microsoft.com/office/drawing/2016/5/9/chartex" xmlns:cx4="http://schemas.microsoft.com/office/drawing/2016/5/10/chartex" xmlns:cx5="http://schemas.microsoft.com/office/drawing/2016/5/11/chartex" xmlns:cx6="http://schemas.microsoft.com/office/drawing/2016/5/12/chartex" xmlns:cx7="http://schemas.microsoft.com/office/drawing/2016/5/13/chartex" xmlns:cx8="http://schemas.microsoft.com/office/drawing/2016/5/14/chartex" xmlns:mc="http://schemas.openxmlformats.org/markup-compatibility/2006" xmlns:aink="http://schemas.microsoft.com/office/drawing/2016/ink" xmlns:am3d="http://schemas.microsoft.com/office/drawing/2017/model3d" xmlns:o="urn:schemas-microsoft-com:office:office" xmlns:oel="http://schemas.microsoft.com/office/2019/extlst" xmlns:r="http://schemas.openxmlformats.org/officeDocument/2006/relationships" xmlns:m="http://schemas.openxmlformats.org/officeDocument/2006/math" xmlns:v="urn:schemas-microsoft-com:vml" xmlns:wp14="http://schemas.microsoft.com/office/word/2010/wordprocessingDrawing" xmlns:wp="http://schemas.openxmlformats.org/drawingml/2006/wordprocessingDrawing" xmlns:w10="urn:schemas-microsoft-com:office:word" xmlns:w="http://schemas.openxmlformats.org/wordprocessingml/2006/main" xmlns:w14="http://schemas.microsoft.com/office/word/2010/wordml" xmlns:w15="http://schemas.microsoft.com/office/word/2012/wordml" xmlns:w16cex="http://schemas.microsoft.com/office/word/2018/wordml/cex" xmlns:w16cid="http://schemas.microsoft.com/office/word/2016/wordml/cid" xmlns:w16="http://schemas.microsoft.com/office/word/2018/wordml" xmlns:w16du="http://schemas.microsoft.com/office/word/2023/wordml/word16du" xmlns:w16sdtdh="http://schemas.microsoft.com/office/word/2020/wordml/sdtdatahash" xmlns:w16sdtfl="http://schemas.microsoft.com/office/word/2024/wordml/sdtformatlock" xmlns:w16se="http://schemas.microsoft.com/office/word/2015/wordml/symex" xmlns:wpg="http://schemas.microsoft.com/office/word/2010/wordprocessingGroup" xmlns:wpi="http://schemas.microsoft.com/office/word/2010/wordprocessingInk" xmlns:wne="http://schemas.microsoft.com/office/word/2006/wordml" xmlns:wps="http://schemas.microsoft.com/office/word/2010/wordprocessingShape" mc:Ignorable="w14 w15 w16se w16cid w16 w16cex w16sdtdh w16sdtfl w16du wp14">
+<w15:people xmlns:wpc="http://schemas.microsoft.com/office/word/2010/wordprocessingCanvas" xmlns:cx="http://schemas.microsoft.com/office/drawing/2014/chartex" xmlns:cx1="http://schemas.microsoft.com/office/drawing/2015/9/8/chartex" xmlns:cx2="http://schemas.microsoft.com/office/drawing/2015/10/21/chartex" xmlns:cx3="http://schemas.microsoft.com/office/drawing/2016/5/9/chartex" xmlns:cx4="http://schemas.microsoft.com/office/drawing/2016/5/10/chartex" xmlns:cx5="http://schemas.microsoft.com/office/drawing/2016/5/11/chartex" xmlns:cx6="http://schemas.microsoft.com/office/drawing/2016/5/12/chartex" xmlns:cx7="http://schemas.microsoft.com/office/drawing/2016/5/13/chartex" xmlns:cx8="http://schemas.microsoft.com/office/drawing/2016/5/14/chartex" xmlns:mc="http://schemas.openxmlformats.org/markup-compatibility/2006" xmlns:aink="http://schemas.microsoft.com/office/drawing/2016/ink" xmlns:am3d="http://schemas.microsoft.com/office/drawing/2017/model3d" xmlns:o="urn:schemas-microsoft-com:office:office" xmlns:oel="http://schemas.microsoft.com/office/2019/extlst" xmlns:r="http://schemas.openxmlformats.org/officeDocument/2006/relationships" xmlns:m="http://schemas.openxmlformats.org/officeDocument/2006/math" xmlns:v="urn:schemas-microsoft-com:vml" xmlns:wp14="http://schemas.microsoft.com/office/word/2010/wordprocessingDrawing" xmlns:wp="http://schemas.openxmlformats.org/drawingml/2006/wordprocessingDrawing" xmlns:w10="urn:schemas-microsoft-com:office:word" xmlns:w="http://schemas.openxmlformats.org/wordprocessingml/2006/main" xmlns:w14="http://schemas.microsoft.com/office/word/2010/wordml" xmlns:w15="http://schemas.microsoft.com/office/word/2012/wordml" xmlns:w16cei="http://schemas.microsoft.com/office/word/2026/wordml/cei" xmlns:w16cex="http://schemas.microsoft.com/office/word/2018/wordml/cex" xmlns:w16cid="http://schemas.microsoft.com/office/word/2016/wordml/cid" xmlns:w16="http://schemas.microsoft.com/office/word/2018/wordml" xmlns:w16du="http://schemas.microsoft.com/office/word/2023/wordml/word16du" xmlns:w16sdtdh="http://schemas.microsoft.com/office/word/2020/wordml/sdtdatahash" xmlns:w16sdtfl="http://schemas.microsoft.com/office/word/2024/wordml/sdtformatlock" xmlns:w16se="http://schemas.microsoft.com/office/word/2015/wordml/symex" xmlns:wpg="http://schemas.microsoft.com/office/word/2010/wordprocessingGroup" xmlns:wpi="http://schemas.microsoft.com/office/word/2010/wordprocessingInk" xmlns:wne="http://schemas.microsoft.com/office/word/2006/wordml" xmlns:wps="http://schemas.microsoft.com/office/word/2010/wordprocessingShape" mc:Ignorable="w14 w15 w16se w16cid w16 w16cex w16sdtdh w16sdtfl w16du wp14">
   <w15:person w15:author="Antonio Ortega">
     <w15:presenceInfo w15:providerId="AD" w15:userId="S::antonio.ortega@kuleuven.be::c6a747d7-790b-47e4-ae95-b117223a48b4"/>
   </w15:person>

</xml_diff>

<commit_message>
Update abstract based on feedback
</commit_message>
<xml_diff>
--- a/abstract.docx
+++ b/abstract.docx
@@ -1,6 +1,6 @@
 
 <file path=word/document.xml><?xml version="1.0" encoding="utf-8"?>
-<w:document xmlns:wpc="http://schemas.microsoft.com/office/word/2010/wordprocessingCanvas" xmlns:cx="http://schemas.microsoft.com/office/drawing/2014/chartex" xmlns:cx1="http://schemas.microsoft.com/office/drawing/2015/9/8/chartex" xmlns:cx2="http://schemas.microsoft.com/office/drawing/2015/10/21/chartex" xmlns:cx3="http://schemas.microsoft.com/office/drawing/2016/5/9/chartex" xmlns:cx4="http://schemas.microsoft.com/office/drawing/2016/5/10/chartex" xmlns:cx5="http://schemas.microsoft.com/office/drawing/2016/5/11/chartex" xmlns:cx6="http://schemas.microsoft.com/office/drawing/2016/5/12/chartex" xmlns:cx7="http://schemas.microsoft.com/office/drawing/2016/5/13/chartex" xmlns:cx8="http://schemas.microsoft.com/office/drawing/2016/5/14/chartex" xmlns:mc="http://schemas.openxmlformats.org/markup-compatibility/2006" xmlns:aink="http://schemas.microsoft.com/office/drawing/2016/ink" xmlns:am3d="http://schemas.microsoft.com/office/drawing/2017/model3d" xmlns:o="urn:schemas-microsoft-com:office:office" xmlns:oel="http://schemas.microsoft.com/office/2019/extlst" xmlns:r="http://schemas.openxmlformats.org/officeDocument/2006/relationships" xmlns:m="http://schemas.openxmlformats.org/officeDocument/2006/math" xmlns:v="urn:schemas-microsoft-com:vml" xmlns:wp14="http://schemas.microsoft.com/office/word/2010/wordprocessingDrawing" xmlns:wp="http://schemas.openxmlformats.org/drawingml/2006/wordprocessingDrawing" xmlns:w10="urn:schemas-microsoft-com:office:word" xmlns:w="http://schemas.openxmlformats.org/wordprocessingml/2006/main" xmlns:w14="http://schemas.microsoft.com/office/word/2010/wordml" xmlns:w15="http://schemas.microsoft.com/office/word/2012/wordml" xmlns:w16cex="http://schemas.microsoft.com/office/word/2018/wordml/cex" xmlns:w16cid="http://schemas.microsoft.com/office/word/2016/wordml/cid" xmlns:w16="http://schemas.microsoft.com/office/word/2018/wordml" xmlns:w16du="http://schemas.microsoft.com/office/word/2023/wordml/word16du" xmlns:w16sdtdh="http://schemas.microsoft.com/office/word/2020/wordml/sdtdatahash" xmlns:w16sdtfl="http://schemas.microsoft.com/office/word/2024/wordml/sdtformatlock" xmlns:w16se="http://schemas.microsoft.com/office/word/2015/wordml/symex" xmlns:wpg="http://schemas.microsoft.com/office/word/2010/wordprocessingGroup" xmlns:wpi="http://schemas.microsoft.com/office/word/2010/wordprocessingInk" xmlns:wne="http://schemas.microsoft.com/office/word/2006/wordml" xmlns:wps="http://schemas.microsoft.com/office/word/2010/wordprocessingShape" mc:Ignorable="w14 w15 w16se w16cid w16 w16cex w16sdtdh w16sdtfl w16du wp14">
+<w:document xmlns:wpc="http://schemas.microsoft.com/office/word/2010/wordprocessingCanvas" xmlns:cx="http://schemas.microsoft.com/office/drawing/2014/chartex" xmlns:cx1="http://schemas.microsoft.com/office/drawing/2015/9/8/chartex" xmlns:cx2="http://schemas.microsoft.com/office/drawing/2015/10/21/chartex" xmlns:cx3="http://schemas.microsoft.com/office/drawing/2016/5/9/chartex" xmlns:cx4="http://schemas.microsoft.com/office/drawing/2016/5/10/chartex" xmlns:cx5="http://schemas.microsoft.com/office/drawing/2016/5/11/chartex" xmlns:cx6="http://schemas.microsoft.com/office/drawing/2016/5/12/chartex" xmlns:cx7="http://schemas.microsoft.com/office/drawing/2016/5/13/chartex" xmlns:cx8="http://schemas.microsoft.com/office/drawing/2016/5/14/chartex" xmlns:mc="http://schemas.openxmlformats.org/markup-compatibility/2006" xmlns:aink="http://schemas.microsoft.com/office/drawing/2016/ink" xmlns:am3d="http://schemas.microsoft.com/office/drawing/2017/model3d" xmlns:o="urn:schemas-microsoft-com:office:office" xmlns:oel="http://schemas.microsoft.com/office/2019/extlst" xmlns:r="http://schemas.openxmlformats.org/officeDocument/2006/relationships" xmlns:m="http://schemas.openxmlformats.org/officeDocument/2006/math" xmlns:v="urn:schemas-microsoft-com:vml" xmlns:wp14="http://schemas.microsoft.com/office/word/2010/wordprocessingDrawing" xmlns:wp="http://schemas.openxmlformats.org/drawingml/2006/wordprocessingDrawing" xmlns:w10="urn:schemas-microsoft-com:office:word" xmlns:w="http://schemas.openxmlformats.org/wordprocessingml/2006/main" xmlns:w14="http://schemas.microsoft.com/office/word/2010/wordml" xmlns:w15="http://schemas.microsoft.com/office/word/2012/wordml" xmlns:w16cei="http://schemas.microsoft.com/office/word/2026/wordml/cei" xmlns:w16cex="http://schemas.microsoft.com/office/word/2018/wordml/cex" xmlns:w16cid="http://schemas.microsoft.com/office/word/2016/wordml/cid" xmlns:w16="http://schemas.microsoft.com/office/word/2018/wordml" xmlns:w16du="http://schemas.microsoft.com/office/word/2023/wordml/word16du" xmlns:w16sdtdh="http://schemas.microsoft.com/office/word/2020/wordml/sdtdatahash" xmlns:w16sdtfl="http://schemas.microsoft.com/office/word/2024/wordml/sdtformatlock" xmlns:w16se="http://schemas.microsoft.com/office/word/2015/wordml/symex" xmlns:wpg="http://schemas.microsoft.com/office/word/2010/wordprocessingGroup" xmlns:wpi="http://schemas.microsoft.com/office/word/2010/wordprocessingInk" xmlns:wne="http://schemas.microsoft.com/office/word/2006/wordml" xmlns:wps="http://schemas.microsoft.com/office/word/2010/wordprocessingShape" mc:Ignorable="w14 w15 w16se w16cid w16 w16cex w16sdtdh w16sdtfl w16du wp14">
   <w:body>
     <w:p>
       <w:pPr>
@@ -75,9 +75,6 @@
         <w:rPr>
           <w:lang w:val="en-IN"/>
         </w:rPr>
-        <w:pPrChange w:id="1" w:author="Antonio Ortega" w:date="2026-09-28T22:11:00Z" w16du:dateUtc="2026-09-28T20:11:00Z">
-          <w:pPr/>
-        </w:pPrChange>
       </w:pPr>
       <w:r>
         <w:rPr>
@@ -104,24 +101,64 @@
       <w:pPr>
         <w:jc w:val="both"/>
         <w:rPr>
-          <w:ins w:id="2" w:author="Antonio Ortega" w:date="2026-09-28T22:12:00Z" w16du:dateUtc="2026-09-28T20:12:00Z"/>
-          <w:lang w:val="en-IN"/>
-        </w:rPr>
-      </w:pPr>
-      <w:r>
-        <w:rPr>
-          <w:lang w:val="en-IN"/>
-        </w:rPr>
-        <w:t xml:space="preserve">In this project, we demonstrate how the application of idtracker.ai, a system that deploys semi-supervised machine learning, combined with careful human supervision and delivered via the Computer Vision Annotation Tool (CVAT), can be used to interrogate </w:t>
-      </w:r>
-      <w:commentRangeStart w:id="3"/>
-      <w:r>
-        <w:rPr>
-          <w:lang w:val="en-IN"/>
-        </w:rPr>
-        <w:t xml:space="preserve">the system </w:t>
-      </w:r>
-      <w:commentRangeEnd w:id="3"/>
+          <w:lang w:val="en-IN"/>
+        </w:rPr>
+      </w:pPr>
+      <w:r>
+        <w:rPr>
+          <w:lang w:val="en-IN"/>
+        </w:rPr>
+        <w:t xml:space="preserve">In this project, we demonstrate how the application of idtracker.ai, a system that deploys semi-supervised machine learning, combined with careful human supervision and delivered via the Computer Vision Annotation Tool (CVAT), </w:t>
+      </w:r>
+      <w:r>
+        <w:t>can be used to study whether and how flies socially influence each other's sleep</w:t>
+      </w:r>
+      <w:r>
+        <w:rPr>
+          <w:lang w:val="en-IN"/>
+        </w:rPr>
+        <w:t>.</w:t>
+      </w:r>
+      <w:r>
+        <w:rPr>
+          <w:lang w:val="en-IN"/>
+        </w:rPr>
+        <w:t>Furthermore, the analysis of the animal’s pose provides a richer description of its behavior than simple centroid tracking can capture. We used this descriptive wealth to more accurately assess the sleep/wake state of each animal in the group, as well as to capture relevant micro-behaviors and social interactions.</w:t>
+      </w:r>
+    </w:p>
+    <w:p>
+      <w:pPr>
+        <w:jc w:val="both"/>
+        <w:rPr>
+          <w:lang w:val="en-IN"/>
+        </w:rPr>
+      </w:pPr>
+      <w:r>
+        <w:rPr>
+          <w:lang w:val="en-IN"/>
+        </w:rPr>
+        <w:t xml:space="preserve">By linking individual sleep patterns to group dynamics, this approach provides a powerful framework for investigating how social environments influence sleep behavior. These methods enable quantitative analyses of the relationships between sleep, social interactions, and group dynamics at the level of individual animals. To date, </w:t>
+      </w:r>
+      <w:commentRangeStart w:id="1"/>
+      <w:r>
+        <w:rPr>
+          <w:lang w:val="en-IN"/>
+        </w:rPr>
+        <w:t xml:space="preserve">we have </w:t>
+      </w:r>
+      <w:r>
+        <w:rPr>
+          <w:lang w:val="en-IN"/>
+        </w:rPr>
+        <w:t>successfully</w:t>
+      </w:r>
+      <w:r>
+        <w:rPr>
+          <w:lang w:val="en-IN"/>
+        </w:rPr>
+        <w:t xml:space="preserve"> </w:t>
+      </w:r>
+      <w:commentRangeEnd w:id="1"/>
       <w:r>
         <w:rPr>
           <w:rStyle w:val="CommentReference"/>
@@ -129,109 +166,32 @@
           <w:szCs w:val="22"/>
           <w:lang w:val="en-IN"/>
         </w:rPr>
-        <w:commentReference w:id="3"/>
-      </w:r>
-      <w:r>
-        <w:rPr>
-          <w:lang w:val="en-IN"/>
-        </w:rPr>
-        <w:t>and study whether and how flies socially influence each other’s sleep.</w:t>
-      </w:r>
-    </w:p>
-    <w:p>
-      <w:pPr>
-        <w:jc w:val="both"/>
-        <w:rPr>
-          <w:lang w:val="en-IN"/>
-        </w:rPr>
-        <w:pPrChange w:id="4" w:author="Antonio Ortega" w:date="2026-09-28T22:11:00Z" w16du:dateUtc="2026-09-28T20:11:00Z">
-          <w:pPr/>
-        </w:pPrChange>
-      </w:pPr>
-      <w:del w:id="5" w:author="Antonio Ortega" w:date="2026-09-28T22:12:00Z" w16du:dateUtc="2026-09-28T20:12:00Z">
-        <w:r>
-          <w:rPr>
-            <w:lang w:val="en-IN"/>
-          </w:rPr>
-          <w:delText xml:space="preserve"> </w:delText>
-        </w:r>
-      </w:del>
-      <w:r>
-        <w:rPr>
-          <w:lang w:val="en-IN"/>
-        </w:rPr>
-        <w:t>Furthermore, the analysis of the animal’s pose provides a richer description of its behavior than simple centroid tracking can capture. We used this descriptive wealth to more accurately assess the sleep/wake state of each animal in the group, as well as to capture relevant micro-behaviors and social interactions.</w:t>
-      </w:r>
-    </w:p>
-    <w:p>
-      <w:pPr>
-        <w:jc w:val="both"/>
-        <w:rPr>
-          <w:lang w:val="en-IN"/>
-        </w:rPr>
-        <w:pPrChange w:id="6" w:author="Antonio Ortega" w:date="2026-09-28T22:11:00Z" w16du:dateUtc="2026-09-28T20:11:00Z">
-          <w:pPr/>
-        </w:pPrChange>
-      </w:pPr>
-      <w:r>
-        <w:rPr>
-          <w:lang w:val="en-IN"/>
-        </w:rPr>
-        <w:t xml:space="preserve">By linking individual sleep patterns to group dynamics, this approach provides a powerful framework for investigating how social environments influence sleep behavior. These methods enable quantitative analyses of the relationships between sleep, social interactions, and group dynamics at the level of individual animals. To date, </w:t>
-      </w:r>
-      <w:commentRangeStart w:id="7"/>
-      <w:ins w:id="8" w:author="Antonio Ortega" w:date="2026-09-28T22:13:00Z" w16du:dateUtc="2026-09-28T20:13:00Z">
-        <w:r>
-          <w:rPr>
-            <w:lang w:val="en-IN"/>
-          </w:rPr>
-          <w:t xml:space="preserve">we have </w:t>
-        </w:r>
-      </w:ins>
+        <w:commentReference w:id="1"/>
+      </w:r>
+      <w:r>
+        <w:rPr>
+          <w:lang w:val="en-IN"/>
+        </w:rPr>
+        <w:t xml:space="preserve">applied </w:t>
+      </w:r>
       <w:r>
         <w:rPr>
           <w:lang w:val="en-IN"/>
         </w:rPr>
         <w:t xml:space="preserve">idtracker.ai </w:t>
       </w:r>
-      <w:del w:id="9" w:author="Antonio Ortega" w:date="2026-09-28T22:13:00Z" w16du:dateUtc="2026-09-28T20:13:00Z">
-        <w:r>
-          <w:rPr>
-            <w:lang w:val="en-IN"/>
-          </w:rPr>
-          <w:delText xml:space="preserve">has been </w:delText>
-        </w:r>
-      </w:del>
-      <w:r>
-        <w:rPr>
-          <w:lang w:val="en-IN"/>
-        </w:rPr>
-        <w:t xml:space="preserve">successfully </w:t>
-      </w:r>
-      <w:commentRangeEnd w:id="7"/>
-      <w:r>
-        <w:rPr>
-          <w:rStyle w:val="CommentReference"/>
-          <w:sz w:val="22"/>
-          <w:szCs w:val="22"/>
-          <w:lang w:val="en-IN"/>
-        </w:rPr>
-        <w:commentReference w:id="7"/>
-      </w:r>
-      <w:r>
-        <w:rPr>
-          <w:lang w:val="en-IN"/>
-        </w:rPr>
-        <w:t>applied to groups of up to six flies, enabling simultaneous quantification of sleep-wake transitions and social interactions. In future</w:t>
-      </w:r>
-      <w:ins w:id="10" w:author="Antonio Ortega" w:date="2026-09-28T22:13:00Z" w16du:dateUtc="2026-09-28T20:13:00Z">
-        <w:r>
-          <w:rPr>
-            <w:lang w:val="en-IN"/>
-          </w:rPr>
-          <w:t xml:space="preserve"> work</w:t>
-        </w:r>
-      </w:ins>
+      <w:r>
+        <w:rPr>
+          <w:lang w:val="en-IN"/>
+        </w:rPr>
+        <w:t>to groups of up to six flies, enabling simultaneous quantification of sleep-wake transitions and social interactions. In future</w:t>
+      </w:r>
+      <w:r>
+        <w:rPr>
+          <w:lang w:val="en-IN"/>
+        </w:rPr>
+        <w:t xml:space="preserve"> work</w:t>
+      </w:r>
       <w:r>
         <w:rPr>
           <w:lang w:val="en-IN"/>
@@ -251,7 +211,7 @@
 </file>
 
 <file path=word/comments.xml><?xml version="1.0" encoding="utf-8"?>
-<w:comments xmlns:wpc="http://schemas.microsoft.com/office/word/2010/wordprocessingCanvas" xmlns:cx="http://schemas.microsoft.com/office/drawing/2014/chartex" xmlns:cx1="http://schemas.microsoft.com/office/drawing/2015/9/8/chartex" xmlns:cx2="http://schemas.microsoft.com/office/drawing/2015/10/21/chartex" xmlns:cx3="http://schemas.microsoft.com/office/drawing/2016/5/9/chartex" xmlns:cx4="http://schemas.microsoft.com/office/drawing/2016/5/10/chartex" xmlns:cx5="http://schemas.microsoft.com/office/drawing/2016/5/11/chartex" xmlns:cx6="http://schemas.microsoft.com/office/drawing/2016/5/12/chartex" xmlns:cx7="http://schemas.microsoft.com/office/drawing/2016/5/13/chartex" xmlns:cx8="http://schemas.microsoft.com/office/drawing/2016/5/14/chartex" xmlns:mc="http://schemas.openxmlformats.org/markup-compatibility/2006" xmlns:aink="http://schemas.microsoft.com/office/drawing/2016/ink" xmlns:am3d="http://schemas.microsoft.com/office/drawing/2017/model3d" xmlns:o="urn:schemas-microsoft-com:office:office" xmlns:oel="http://schemas.microsoft.com/office/2019/extlst" xmlns:r="http://schemas.openxmlformats.org/officeDocument/2006/relationships" xmlns:m="http://schemas.openxmlformats.org/officeDocument/2006/math" xmlns:v="urn:schemas-microsoft-com:vml" xmlns:wp14="http://schemas.microsoft.com/office/word/2010/wordprocessingDrawing" xmlns:wp="http://schemas.openxmlformats.org/drawingml/2006/wordprocessingDrawing" xmlns:w10="urn:schemas-microsoft-com:office:word" xmlns:w="http://schemas.openxmlformats.org/wordprocessingml/2006/main" xmlns:w14="http://schemas.microsoft.com/office/word/2010/wordml" xmlns:w15="http://schemas.microsoft.com/office/word/2012/wordml" xmlns:w16cex="http://schemas.microsoft.com/office/word/2018/wordml/cex" xmlns:w16cid="http://schemas.microsoft.com/office/word/2016/wordml/cid" xmlns:w16="http://schemas.microsoft.com/office/word/2018/wordml" xmlns:w16du="http://schemas.microsoft.com/office/word/2023/wordml/word16du" xmlns:w16sdtdh="http://schemas.microsoft.com/office/word/2020/wordml/sdtdatahash" xmlns:w16sdtfl="http://schemas.microsoft.com/office/word/2024/wordml/sdtformatlock" xmlns:w16se="http://schemas.microsoft.com/office/word/2015/wordml/symex" xmlns:wpg="http://schemas.microsoft.com/office/word/2010/wordprocessingGroup" xmlns:wpi="http://schemas.microsoft.com/office/word/2010/wordprocessingInk" xmlns:wne="http://schemas.microsoft.com/office/word/2006/wordml" xmlns:wps="http://schemas.microsoft.com/office/word/2010/wordprocessingShape" mc:Ignorable="w14 w15 w16se w16cid w16 w16cex w16sdtdh w16sdtfl w16du wp14">
+<w:comments xmlns:wpc="http://schemas.microsoft.com/office/word/2010/wordprocessingCanvas" xmlns:cx="http://schemas.microsoft.com/office/drawing/2014/chartex" xmlns:cx1="http://schemas.microsoft.com/office/drawing/2015/9/8/chartex" xmlns:cx2="http://schemas.microsoft.com/office/drawing/2015/10/21/chartex" xmlns:cx3="http://schemas.microsoft.com/office/drawing/2016/5/9/chartex" xmlns:cx4="http://schemas.microsoft.com/office/drawing/2016/5/10/chartex" xmlns:cx5="http://schemas.microsoft.com/office/drawing/2016/5/11/chartex" xmlns:cx6="http://schemas.microsoft.com/office/drawing/2016/5/12/chartex" xmlns:cx7="http://schemas.microsoft.com/office/drawing/2016/5/13/chartex" xmlns:cx8="http://schemas.microsoft.com/office/drawing/2016/5/14/chartex" xmlns:mc="http://schemas.openxmlformats.org/markup-compatibility/2006" xmlns:aink="http://schemas.microsoft.com/office/drawing/2016/ink" xmlns:am3d="http://schemas.microsoft.com/office/drawing/2017/model3d" xmlns:o="urn:schemas-microsoft-com:office:office" xmlns:oel="http://schemas.microsoft.com/office/2019/extlst" xmlns:r="http://schemas.openxmlformats.org/officeDocument/2006/relationships" xmlns:m="http://schemas.openxmlformats.org/officeDocument/2006/math" xmlns:v="urn:schemas-microsoft-com:vml" xmlns:wp14="http://schemas.microsoft.com/office/word/2010/wordprocessingDrawing" xmlns:wp="http://schemas.openxmlformats.org/drawingml/2006/wordprocessingDrawing" xmlns:w10="urn:schemas-microsoft-com:office:word" xmlns:w="http://schemas.openxmlformats.org/wordprocessingml/2006/main" xmlns:w14="http://schemas.microsoft.com/office/word/2010/wordml" xmlns:w15="http://schemas.microsoft.com/office/word/2012/wordml" xmlns:w16cei="http://schemas.microsoft.com/office/word/2026/wordml/cei" xmlns:w16cex="http://schemas.microsoft.com/office/word/2018/wordml/cex" xmlns:w16cid="http://schemas.microsoft.com/office/word/2016/wordml/cid" xmlns:w16="http://schemas.microsoft.com/office/word/2018/wordml" xmlns:w16du="http://schemas.microsoft.com/office/word/2023/wordml/word16du" xmlns:w16sdtdh="http://schemas.microsoft.com/office/word/2020/wordml/sdtdatahash" xmlns:w16sdtfl="http://schemas.microsoft.com/office/word/2024/wordml/sdtformatlock" xmlns:w16se="http://schemas.microsoft.com/office/word/2015/wordml/symex" xmlns:wpg="http://schemas.microsoft.com/office/word/2010/wordprocessingGroup" xmlns:wpi="http://schemas.microsoft.com/office/word/2010/wordprocessingInk" xmlns:wne="http://schemas.microsoft.com/office/word/2006/wordml" xmlns:wps="http://schemas.microsoft.com/office/word/2010/wordprocessingShape" mc:Ignorable="w14 w15 w16se w16cid w16 w16cex w16sdtdh w16sdtfl w16du wp14">
   <w:comment w:id="0" w:author="Antonio Ortega" w:date="2026-09-26T17:34:00Z" w:initials="AO">
     <w:p>
       <w:pPr>
@@ -268,23 +228,7 @@
       </w:r>
     </w:p>
   </w:comment>
-  <w:comment w:id="3" w:author="Antonio Ortega" w:date="2026-09-28T22:12:00Z" w:initials="AO">
-    <w:p>
-      <w:pPr>
-        <w:pStyle w:val="CommentText"/>
-      </w:pPr>
-      <w:r>
-        <w:rPr>
-          <w:rStyle w:val="CommentReference"/>
-        </w:rPr>
-        <w:annotationRef/>
-      </w:r>
-      <w:r>
-        <w:t>Which system?</w:t>
-      </w:r>
-    </w:p>
-  </w:comment>
-  <w:comment w:id="7" w:author="Antonio Ortega" w:date="2026-09-28T22:13:00Z" w:initials="AO">
+  <w:comment w:id="1" w:author="Antonio Ortega" w:date="2026-09-28T22:13:00Z" w:initials="AO">
     <w:p>
       <w:pPr>
         <w:pStyle w:val="CommentText"/>
@@ -304,31 +248,28 @@
 </file>
 
 <file path=word/commentsExtended.xml><?xml version="1.0" encoding="utf-8"?>
-<w15:commentsEx xmlns:wpc="http://schemas.microsoft.com/office/word/2010/wordprocessingCanvas" xmlns:cx="http://schemas.microsoft.com/office/drawing/2014/chartex" xmlns:cx1="http://schemas.microsoft.com/office/drawing/2015/9/8/chartex" xmlns:cx2="http://schemas.microsoft.com/office/drawing/2015/10/21/chartex" xmlns:cx3="http://schemas.microsoft.com/office/drawing/2016/5/9/chartex" xmlns:cx4="http://schemas.microsoft.com/office/drawing/2016/5/10/chartex" xmlns:cx5="http://schemas.microsoft.com/office/drawing/2016/5/11/chartex" xmlns:cx6="http://schemas.microsoft.com/office/drawing/2016/5/12/chartex" xmlns:cx7="http://schemas.microsoft.com/office/drawing/2016/5/13/chartex" xmlns:cx8="http://schemas.microsoft.com/office/drawing/2016/5/14/chartex" xmlns:mc="http://schemas.openxmlformats.org/markup-compatibility/2006" xmlns:aink="http://schemas.microsoft.com/office/drawing/2016/ink" xmlns:am3d="http://schemas.microsoft.com/office/drawing/2017/model3d" xmlns:o="urn:schemas-microsoft-com:office:office" xmlns:oel="http://schemas.microsoft.com/office/2019/extlst" xmlns:r="http://schemas.openxmlformats.org/officeDocument/2006/relationships" xmlns:m="http://schemas.openxmlformats.org/officeDocument/2006/math" xmlns:v="urn:schemas-microsoft-com:vml" xmlns:wp14="http://schemas.microsoft.com/office/word/2010/wordprocessingDrawing" xmlns:wp="http://schemas.openxmlformats.org/drawingml/2006/wordprocessingDrawing" xmlns:w10="urn:schemas-microsoft-com:office:word" xmlns:w="http://schemas.openxmlformats.org/wordprocessingml/2006/main" xmlns:w14="http://schemas.microsoft.com/office/word/2010/wordml" xmlns:w15="http://schemas.microsoft.com/office/word/2012/wordml" xmlns:w16cex="http://schemas.microsoft.com/office/word/2018/wordml/cex" xmlns:w16cid="http://schemas.microsoft.com/office/word/2016/wordml/cid" xmlns:w16="http://schemas.microsoft.com/office/word/2018/wordml" xmlns:w16du="http://schemas.microsoft.com/office/word/2023/wordml/word16du" xmlns:w16sdtdh="http://schemas.microsoft.com/office/word/2020/wordml/sdtdatahash" xmlns:w16sdtfl="http://schemas.microsoft.com/office/word/2024/wordml/sdtformatlock" xmlns:w16se="http://schemas.microsoft.com/office/word/2015/wordml/symex" xmlns:wpg="http://schemas.microsoft.com/office/word/2010/wordprocessingGroup" xmlns:wpi="http://schemas.microsoft.com/office/word/2010/wordprocessingInk" xmlns:wne="http://schemas.microsoft.com/office/word/2006/wordml" xmlns:wps="http://schemas.microsoft.com/office/word/2010/wordprocessingShape" mc:Ignorable="w14 w15 w16se w16cid w16 w16cex w16sdtdh w16sdtfl w16du wp14">
+<w15:commentsEx xmlns:wpc="http://schemas.microsoft.com/office/word/2010/wordprocessingCanvas" xmlns:cx="http://schemas.microsoft.com/office/drawing/2014/chartex" xmlns:cx1="http://schemas.microsoft.com/office/drawing/2015/9/8/chartex" xmlns:cx2="http://schemas.microsoft.com/office/drawing/2015/10/21/chartex" xmlns:cx3="http://schemas.microsoft.com/office/drawing/2016/5/9/chartex" xmlns:cx4="http://schemas.microsoft.com/office/drawing/2016/5/10/chartex" xmlns:cx5="http://schemas.microsoft.com/office/drawing/2016/5/11/chartex" xmlns:cx6="http://schemas.microsoft.com/office/drawing/2016/5/12/chartex" xmlns:cx7="http://schemas.microsoft.com/office/drawing/2016/5/13/chartex" xmlns:cx8="http://schemas.microsoft.com/office/drawing/2016/5/14/chartex" xmlns:mc="http://schemas.openxmlformats.org/markup-compatibility/2006" xmlns:aink="http://schemas.microsoft.com/office/drawing/2016/ink" xmlns:am3d="http://schemas.microsoft.com/office/drawing/2017/model3d" xmlns:o="urn:schemas-microsoft-com:office:office" xmlns:oel="http://schemas.microsoft.com/office/2019/extlst" xmlns:r="http://schemas.openxmlformats.org/officeDocument/2006/relationships" xmlns:m="http://schemas.openxmlformats.org/officeDocument/2006/math" xmlns:v="urn:schemas-microsoft-com:vml" xmlns:wp14="http://schemas.microsoft.com/office/word/2010/wordprocessingDrawing" xmlns:wp="http://schemas.openxmlformats.org/drawingml/2006/wordprocessingDrawing" xmlns:w10="urn:schemas-microsoft-com:office:word" xmlns:w="http://schemas.openxmlformats.org/wordprocessingml/2006/main" xmlns:w14="http://schemas.microsoft.com/office/word/2010/wordml" xmlns:w15="http://schemas.microsoft.com/office/word/2012/wordml" xmlns:w16cei="http://schemas.microsoft.com/office/word/2026/wordml/cei" xmlns:w16cex="http://schemas.microsoft.com/office/word/2018/wordml/cex" xmlns:w16cid="http://schemas.microsoft.com/office/word/2016/wordml/cid" xmlns:w16="http://schemas.microsoft.com/office/word/2018/wordml" xmlns:w16du="http://schemas.microsoft.com/office/word/2023/wordml/word16du" xmlns:w16sdtdh="http://schemas.microsoft.com/office/word/2020/wordml/sdtdatahash" xmlns:w16sdtfl="http://schemas.microsoft.com/office/word/2024/wordml/sdtformatlock" xmlns:w16se="http://schemas.microsoft.com/office/word/2015/wordml/symex" xmlns:wpg="http://schemas.microsoft.com/office/word/2010/wordprocessingGroup" xmlns:wpi="http://schemas.microsoft.com/office/word/2010/wordprocessingInk" xmlns:wne="http://schemas.microsoft.com/office/word/2006/wordml" xmlns:wps="http://schemas.microsoft.com/office/word/2010/wordprocessingShape" mc:Ignorable="w14 w15 w16se w16cid w16 w16cex w16sdtdh w16sdtfl w16du wp14">
   <w15:commentEx w15:paraId="42759EF0" w15:done="1"/>
-  <w15:commentEx w15:paraId="7EE0EE2F" w15:done="0"/>
   <w15:commentEx w15:paraId="6435261F" w15:done="0"/>
 </w15:commentsEx>
 </file>
 
 <file path=word/commentsExtensible.xml><?xml version="1.0" encoding="utf-8"?>
-<w16cex:commentsExtensible xmlns:wpc="http://schemas.microsoft.com/office/word/2010/wordprocessingCanvas" xmlns:cx="http://schemas.microsoft.com/office/drawing/2014/chartex" xmlns:cx1="http://schemas.microsoft.com/office/drawing/2015/9/8/chartex" xmlns:cx2="http://schemas.microsoft.com/office/drawing/2015/10/21/chartex" xmlns:cx3="http://schemas.microsoft.com/office/drawing/2016/5/9/chartex" xmlns:cx4="http://schemas.microsoft.com/office/drawing/2016/5/10/chartex" xmlns:cx5="http://schemas.microsoft.com/office/drawing/2016/5/11/chartex" xmlns:cx6="http://schemas.microsoft.com/office/drawing/2016/5/12/chartex" xmlns:cx7="http://schemas.microsoft.com/office/drawing/2016/5/13/chartex" xmlns:cx8="http://schemas.microsoft.com/office/drawing/2016/5/14/chartex" xmlns:cr="http://schemas.microsoft.com/office/comments/2020/reactions" xmlns:mc="http://schemas.openxmlformats.org/markup-compatibility/2006" xmlns:aink="http://schemas.microsoft.com/office/drawing/2016/ink" xmlns:am3d="http://schemas.microsoft.com/office/drawing/2017/model3d" xmlns:o="urn:schemas-microsoft-com:office:office" xmlns:oel="http://schemas.microsoft.com/office/2019/extlst" xmlns:r="http://schemas.openxmlformats.org/officeDocument/2006/relationships" xmlns:m="http://schemas.openxmlformats.org/officeDocument/2006/math" xmlns:v="urn:schemas-microsoft-com:vml" xmlns:wp14="http://schemas.microsoft.com/office/word/2010/wordprocessingDrawing" xmlns:wp="http://schemas.openxmlformats.org/drawingml/2006/wordprocessingDrawing" xmlns:w10="urn:schemas-microsoft-com:office:word" xmlns:w="http://schemas.openxmlformats.org/wordprocessingml/2006/main" xmlns:w14="http://schemas.microsoft.com/office/word/2010/wordml" xmlns:w15="http://schemas.microsoft.com/office/word/2012/wordml" xmlns:w16cex="http://schemas.microsoft.com/office/word/2018/wordml/cex" xmlns:w16cid="http://schemas.microsoft.com/office/word/2016/wordml/cid" xmlns:w16="http://schemas.microsoft.com/office/word/2018/wordml" xmlns:w16du="http://schemas.microsoft.com/office/word/2023/wordml/word16du" xmlns:w16sdtdh="http://schemas.microsoft.com/office/word/2020/wordml/sdtdatahash" xmlns:w16sdtfl="http://schemas.microsoft.com/office/word/2024/wordml/sdtformatlock" xmlns:w16se="http://schemas.microsoft.com/office/word/2015/wordml/symex" xmlns:wpg="http://schemas.microsoft.com/office/word/2010/wordprocessingGroup" xmlns:wpi="http://schemas.microsoft.com/office/word/2010/wordprocessingInk" xmlns:wne="http://schemas.microsoft.com/office/word/2006/wordml" xmlns:wps="http://schemas.microsoft.com/office/word/2010/wordprocessingShape" mc:Ignorable="w14 w15 w16se w16cid w16 w16cex w16sdtdh w16sdtfl cr w16du wp14">
+<w16cex:commentsExtensible xmlns:wpc="http://schemas.microsoft.com/office/word/2010/wordprocessingCanvas" xmlns:cx="http://schemas.microsoft.com/office/drawing/2014/chartex" xmlns:cx1="http://schemas.microsoft.com/office/drawing/2015/9/8/chartex" xmlns:cx2="http://schemas.microsoft.com/office/drawing/2015/10/21/chartex" xmlns:cx3="http://schemas.microsoft.com/office/drawing/2016/5/9/chartex" xmlns:cx4="http://schemas.microsoft.com/office/drawing/2016/5/10/chartex" xmlns:cx5="http://schemas.microsoft.com/office/drawing/2016/5/11/chartex" xmlns:cx6="http://schemas.microsoft.com/office/drawing/2016/5/12/chartex" xmlns:cx7="http://schemas.microsoft.com/office/drawing/2016/5/13/chartex" xmlns:cx8="http://schemas.microsoft.com/office/drawing/2016/5/14/chartex" xmlns:cr="http://schemas.microsoft.com/office/comments/2020/reactions" xmlns:mc="http://schemas.openxmlformats.org/markup-compatibility/2006" xmlns:aink="http://schemas.microsoft.com/office/drawing/2016/ink" xmlns:am3d="http://schemas.microsoft.com/office/drawing/2017/model3d" xmlns:o="urn:schemas-microsoft-com:office:office" xmlns:oel="http://schemas.microsoft.com/office/2019/extlst" xmlns:r="http://schemas.openxmlformats.org/officeDocument/2006/relationships" xmlns:m="http://schemas.openxmlformats.org/officeDocument/2006/math" xmlns:v="urn:schemas-microsoft-com:vml" xmlns:wp14="http://schemas.microsoft.com/office/word/2010/wordprocessingDrawing" xmlns:wp="http://schemas.openxmlformats.org/drawingml/2006/wordprocessingDrawing" xmlns:w10="urn:schemas-microsoft-com:office:word" xmlns:w="http://schemas.openxmlformats.org/wordprocessingml/2006/main" xmlns:w14="http://schemas.microsoft.com/office/word/2010/wordml" xmlns:w15="http://schemas.microsoft.com/office/word/2012/wordml" xmlns:w16cei="http://schemas.microsoft.com/office/word/2026/wordml/cei" xmlns:w16cex="http://schemas.microsoft.com/office/word/2018/wordml/cex" xmlns:w16cid="http://schemas.microsoft.com/office/word/2016/wordml/cid" xmlns:w16="http://schemas.microsoft.com/office/word/2018/wordml" xmlns:w16du="http://schemas.microsoft.com/office/word/2023/wordml/word16du" xmlns:w16sdtdh="http://schemas.microsoft.com/office/word/2020/wordml/sdtdatahash" xmlns:w16sdtfl="http://schemas.microsoft.com/office/word/2024/wordml/sdtformatlock" xmlns:w16se="http://schemas.microsoft.com/office/word/2015/wordml/symex" xmlns:wpg="http://schemas.microsoft.com/office/word/2010/wordprocessingGroup" xmlns:wpi="http://schemas.microsoft.com/office/word/2010/wordprocessingInk" xmlns:wne="http://schemas.microsoft.com/office/word/2006/wordml" xmlns:wps="http://schemas.microsoft.com/office/word/2010/wordprocessingShape" mc:Ignorable="w14 w15 w16se w16cid w16 w16cex w16sdtdh w16sdtfl cr w16du wp14">
   <w16cex:commentExtensible w16cex:durableId="7FB3E401" w16cex:dateUtc="2026-09-26T15:34:00Z"/>
-  <w16cex:commentExtensible w16cex:durableId="0230F990" w16cex:dateUtc="2026-09-28T20:12:00Z"/>
   <w16cex:commentExtensible w16cex:durableId="32DDEDBD" w16cex:dateUtc="2026-09-28T20:13:00Z"/>
 </w16cex:commentsExtensible>
 </file>
 
 <file path=word/commentsIds.xml><?xml version="1.0" encoding="utf-8"?>
-<w16cid:commentsIds xmlns:wpc="http://schemas.microsoft.com/office/word/2010/wordprocessingCanvas" xmlns:cx="http://schemas.microsoft.com/office/drawing/2014/chartex" xmlns:cx1="http://schemas.microsoft.com/office/drawing/2015/9/8/chartex" xmlns:cx2="http://schemas.microsoft.com/office/drawing/2015/10/21/chartex" xmlns:cx3="http://schemas.microsoft.com/office/drawing/2016/5/9/chartex" xmlns:cx4="http://schemas.microsoft.com/office/drawing/2016/5/10/chartex" xmlns:cx5="http://schemas.microsoft.com/office/drawing/2016/5/11/chartex" xmlns:cx6="http://schemas.microsoft.com/office/drawing/2016/5/12/chartex" xmlns:cx7="http://schemas.microsoft.com/office/drawing/2016/5/13/chartex" xmlns:cx8="http://schemas.microsoft.com/office/drawing/2016/5/14/chartex" xmlns:mc="http://schemas.openxmlformats.org/markup-compatibility/2006" xmlns:aink="http://schemas.microsoft.com/office/drawing/2016/ink" xmlns:am3d="http://schemas.microsoft.com/office/drawing/2017/model3d" xmlns:o="urn:schemas-microsoft-com:office:office" xmlns:oel="http://schemas.microsoft.com/office/2019/extlst" xmlns:r="http://schemas.openxmlformats.org/officeDocument/2006/relationships" xmlns:m="http://schemas.openxmlformats.org/officeDocument/2006/math" xmlns:v="urn:schemas-microsoft-com:vml" xmlns:wp14="http://schemas.microsoft.com/office/word/2010/wordprocessingDrawing" xmlns:wp="http://schemas.openxmlformats.org/drawingml/2006/wordprocessingDrawing" xmlns:w10="urn:schemas-microsoft-com:office:word" xmlns:w="http://schemas.openxmlformats.org/wordprocessingml/2006/main" xmlns:w14="http://schemas.microsoft.com/office/word/2010/wordml" xmlns:w15="http://schemas.microsoft.com/office/word/2012/wordml" xmlns:w16cex="http://schemas.microsoft.com/office/word/2018/wordml/cex" xmlns:w16cid="http://schemas.microsoft.com/office/word/2016/wordml/cid" xmlns:w16="http://schemas.microsoft.com/office/word/2018/wordml" xmlns:w16du="http://schemas.microsoft.com/office/word/2023/wordml/word16du" xmlns:w16sdtdh="http://schemas.microsoft.com/office/word/2020/wordml/sdtdatahash" xmlns:w16sdtfl="http://schemas.microsoft.com/office/word/2024/wordml/sdtformatlock" xmlns:w16se="http://schemas.microsoft.com/office/word/2015/wordml/symex" xmlns:wpg="http://schemas.microsoft.com/office/word/2010/wordprocessingGroup" xmlns:wpi="http://schemas.microsoft.com/office/word/2010/wordprocessingInk" xmlns:wne="http://schemas.microsoft.com/office/word/2006/wordml" xmlns:wps="http://schemas.microsoft.com/office/word/2010/wordprocessingShape" mc:Ignorable="w14 w15 w16se w16cid w16 w16cex w16sdtdh w16sdtfl w16du wp14">
+<w16cid:commentsIds xmlns:wpc="http://schemas.microsoft.com/office/word/2010/wordprocessingCanvas" xmlns:cx="http://schemas.microsoft.com/office/drawing/2014/chartex" xmlns:cx1="http://schemas.microsoft.com/office/drawing/2015/9/8/chartex" xmlns:cx2="http://schemas.microsoft.com/office/drawing/2015/10/21/chartex" xmlns:cx3="http://schemas.microsoft.com/office/drawing/2016/5/9/chartex" xmlns:cx4="http://schemas.microsoft.com/office/drawing/2016/5/10/chartex" xmlns:cx5="http://schemas.microsoft.com/office/drawing/2016/5/11/chartex" xmlns:cx6="http://schemas.microsoft.com/office/drawing/2016/5/12/chartex" xmlns:cx7="http://schemas.microsoft.com/office/drawing/2016/5/13/chartex" xmlns:cx8="http://schemas.microsoft.com/office/drawing/2016/5/14/chartex" xmlns:mc="http://schemas.openxmlformats.org/markup-compatibility/2006" xmlns:aink="http://schemas.microsoft.com/office/drawing/2016/ink" xmlns:am3d="http://schemas.microsoft.com/office/drawing/2017/model3d" xmlns:o="urn:schemas-microsoft-com:office:office" xmlns:oel="http://schemas.microsoft.com/office/2019/extlst" xmlns:r="http://schemas.openxmlformats.org/officeDocument/2006/relationships" xmlns:m="http://schemas.openxmlformats.org/officeDocument/2006/math" xmlns:v="urn:schemas-microsoft-com:vml" xmlns:wp14="http://schemas.microsoft.com/office/word/2010/wordprocessingDrawing" xmlns:wp="http://schemas.openxmlformats.org/drawingml/2006/wordprocessingDrawing" xmlns:w10="urn:schemas-microsoft-com:office:word" xmlns:w="http://schemas.openxmlformats.org/wordprocessingml/2006/main" xmlns:w14="http://schemas.microsoft.com/office/word/2010/wordml" xmlns:w15="http://schemas.microsoft.com/office/word/2012/wordml" xmlns:w16cei="http://schemas.microsoft.com/office/word/2026/wordml/cei" xmlns:w16cex="http://schemas.microsoft.com/office/word/2018/wordml/cex" xmlns:w16cid="http://schemas.microsoft.com/office/word/2016/wordml/cid" xmlns:w16="http://schemas.microsoft.com/office/word/2018/wordml" xmlns:w16du="http://schemas.microsoft.com/office/word/2023/wordml/word16du" xmlns:w16sdtdh="http://schemas.microsoft.com/office/word/2020/wordml/sdtdatahash" xmlns:w16sdtfl="http://schemas.microsoft.com/office/word/2024/wordml/sdtformatlock" xmlns:w16se="http://schemas.microsoft.com/office/word/2015/wordml/symex" xmlns:wpg="http://schemas.microsoft.com/office/word/2010/wordprocessingGroup" xmlns:wpi="http://schemas.microsoft.com/office/word/2010/wordprocessingInk" xmlns:wne="http://schemas.microsoft.com/office/word/2006/wordml" xmlns:wps="http://schemas.microsoft.com/office/word/2010/wordprocessingShape" mc:Ignorable="w14 w15 w16se w16cid w16 w16cex w16sdtdh w16sdtfl w16du wp14">
   <w16cid:commentId w16cid:paraId="42759EF0" w16cid:durableId="7FB3E401"/>
-  <w16cid:commentId w16cid:paraId="7EE0EE2F" w16cid:durableId="0230F990"/>
   <w16cid:commentId w16cid:paraId="6435261F" w16cid:durableId="32DDEDBD"/>
 </w16cid:commentsIds>
 </file>
 
 <file path=word/numbering.xml><?xml version="1.0" encoding="utf-8"?>
-<w:numbering xmlns:wpc="http://schemas.microsoft.com/office/word/2010/wordprocessingCanvas" xmlns:cx="http://schemas.microsoft.com/office/drawing/2014/chartex" xmlns:cx1="http://schemas.microsoft.com/office/drawing/2015/9/8/chartex" xmlns:cx2="http://schemas.microsoft.com/office/drawing/2015/10/21/chartex" xmlns:cx3="http://schemas.microsoft.com/office/drawing/2016/5/9/chartex" xmlns:cx4="http://schemas.microsoft.com/office/drawing/2016/5/10/chartex" xmlns:cx5="http://schemas.microsoft.com/office/drawing/2016/5/11/chartex" xmlns:cx6="http://schemas.microsoft.com/office/drawing/2016/5/12/chartex" xmlns:cx7="http://schemas.microsoft.com/office/drawing/2016/5/13/chartex" xmlns:cx8="http://schemas.microsoft.com/office/drawing/2016/5/14/chartex" xmlns:mc="http://schemas.openxmlformats.org/markup-compatibility/2006" xmlns:aink="http://schemas.microsoft.com/office/drawing/2016/ink" xmlns:am3d="http://schemas.microsoft.com/office/drawing/2017/model3d" xmlns:o="urn:schemas-microsoft-com:office:office" xmlns:oel="http://schemas.microsoft.com/office/2019/extlst" xmlns:r="http://schemas.openxmlformats.org/officeDocument/2006/relationships" xmlns:m="http://schemas.openxmlformats.org/officeDocument/2006/math" xmlns:v="urn:schemas-microsoft-com:vml" xmlns:wp14="http://schemas.microsoft.com/office/word/2010/wordprocessingDrawing" xmlns:wp="http://schemas.openxmlformats.org/drawingml/2006/wordprocessingDrawing" xmlns:w10="urn:schemas-microsoft-com:office:word" xmlns:w="http://schemas.openxmlformats.org/wordprocessingml/2006/main" xmlns:w14="http://schemas.microsoft.com/office/word/2010/wordml" xmlns:w15="http://schemas.microsoft.com/office/word/2012/wordml" xmlns:w16cex="http://schemas.microsoft.com/office/word/2018/wordml/cex" xmlns:w16cid="http://schemas.microsoft.com/office/word/2016/wordml/cid" xmlns:w16="http://schemas.microsoft.com/office/word/2018/wordml" xmlns:w16du="http://schemas.microsoft.com/office/word/2023/wordml/word16du" xmlns:w16sdtdh="http://schemas.microsoft.com/office/word/2020/wordml/sdtdatahash" xmlns:w16sdtfl="http://schemas.microsoft.com/office/word/2024/wordml/sdtformatlock" xmlns:w16se="http://schemas.microsoft.com/office/word/2015/wordml/symex" xmlns:wpg="http://schemas.microsoft.com/office/word/2010/wordprocessingGroup" xmlns:wpi="http://schemas.microsoft.com/office/word/2010/wordprocessingInk" xmlns:wne="http://schemas.microsoft.com/office/word/2006/wordml" xmlns:wps="http://schemas.microsoft.com/office/word/2010/wordprocessingShape" mc:Ignorable="w14 w15 w16se w16cid w16 w16cex w16sdtdh w16sdtfl w16du wp14">
+<w:numbering xmlns:wpc="http://schemas.microsoft.com/office/word/2010/wordprocessingCanvas" xmlns:cx="http://schemas.microsoft.com/office/drawing/2014/chartex" xmlns:cx1="http://schemas.microsoft.com/office/drawing/2015/9/8/chartex" xmlns:cx2="http://schemas.microsoft.com/office/drawing/2015/10/21/chartex" xmlns:cx3="http://schemas.microsoft.com/office/drawing/2016/5/9/chartex" xmlns:cx4="http://schemas.microsoft.com/office/drawing/2016/5/10/chartex" xmlns:cx5="http://schemas.microsoft.com/office/drawing/2016/5/11/chartex" xmlns:cx6="http://schemas.microsoft.com/office/drawing/2016/5/12/chartex" xmlns:cx7="http://schemas.microsoft.com/office/drawing/2016/5/13/chartex" xmlns:cx8="http://schemas.microsoft.com/office/drawing/2016/5/14/chartex" xmlns:mc="http://schemas.openxmlformats.org/markup-compatibility/2006" xmlns:aink="http://schemas.microsoft.com/office/drawing/2016/ink" xmlns:am3d="http://schemas.microsoft.com/office/drawing/2017/model3d" xmlns:o="urn:schemas-microsoft-com:office:office" xmlns:oel="http://schemas.microsoft.com/office/2019/extlst" xmlns:r="http://schemas.openxmlformats.org/officeDocument/2006/relationships" xmlns:m="http://schemas.openxmlformats.org/officeDocument/2006/math" xmlns:v="urn:schemas-microsoft-com:vml" xmlns:wp14="http://schemas.microsoft.com/office/word/2010/wordprocessingDrawing" xmlns:wp="http://schemas.openxmlformats.org/drawingml/2006/wordprocessingDrawing" xmlns:w10="urn:schemas-microsoft-com:office:word" xmlns:w="http://schemas.openxmlformats.org/wordprocessingml/2006/main" xmlns:w14="http://schemas.microsoft.com/office/word/2010/wordml" xmlns:w15="http://schemas.microsoft.com/office/word/2012/wordml" xmlns:w16cei="http://schemas.microsoft.com/office/word/2026/wordml/cei" xmlns:w16cex="http://schemas.microsoft.com/office/word/2018/wordml/cex" xmlns:w16cid="http://schemas.microsoft.com/office/word/2016/wordml/cid" xmlns:w16="http://schemas.microsoft.com/office/word/2018/wordml" xmlns:w16du="http://schemas.microsoft.com/office/word/2023/wordml/word16du" xmlns:w16sdtdh="http://schemas.microsoft.com/office/word/2020/wordml/sdtdatahash" xmlns:w16sdtfl="http://schemas.microsoft.com/office/word/2024/wordml/sdtformatlock" xmlns:w16se="http://schemas.microsoft.com/office/word/2015/wordml/symex" xmlns:wpg="http://schemas.microsoft.com/office/word/2010/wordprocessingGroup" xmlns:wpi="http://schemas.microsoft.com/office/word/2010/wordprocessingInk" xmlns:wne="http://schemas.microsoft.com/office/word/2006/wordml" xmlns:wps="http://schemas.microsoft.com/office/word/2010/wordprocessingShape" mc:Ignorable="w14 w15 w16se w16cid w16 w16cex w16sdtdh w16sdtfl w16du wp14">
   <w:abstractNum w:abstractNumId="0" w15:restartNumberingAfterBreak="0">
     <w:nsid w:val="13DB7F35"/>
     <w:multiLevelType w:val="hybridMultilevel"/>
@@ -425,7 +366,7 @@
 </file>
 
 <file path=word/people.xml><?xml version="1.0" encoding="utf-8"?>
-<w15:people xmlns:wpc="http://schemas.microsoft.com/office/word/2010/wordprocessingCanvas" xmlns:cx="http://schemas.microsoft.com/office/drawing/2014/chartex" xmlns:cx1="http://schemas.microsoft.com/office/drawing/2015/9/8/chartex" xmlns:cx2="http://schemas.microsoft.com/office/drawing/2015/10/21/chartex" xmlns:cx3="http://schemas.microsoft.com/office/drawing/2016/5/9/chartex" xmlns:cx4="http://schemas.microsoft.com/office/drawing/2016/5/10/chartex" xmlns:cx5="http://schemas.microsoft.com/office/drawing/2016/5/11/chartex" xmlns:cx6="http://schemas.microsoft.com/office/drawing/2016/5/12/chartex" xmlns:cx7="http://schemas.microsoft.com/office/drawing/2016/5/13/chartex" xmlns:cx8="http://schemas.microsoft.com/office/drawing/2016/5/14/chartex" xmlns:mc="http://schemas.openxmlformats.org/markup-compatibility/2006" xmlns:aink="http://schemas.microsoft.com/office/drawing/2016/ink" xmlns:am3d="http://schemas.microsoft.com/office/drawing/2017/model3d" xmlns:o="urn:schemas-microsoft-com:office:office" xmlns:oel="http://schemas.microsoft.com/office/2019/extlst" xmlns:r="http://schemas.openxmlformats.org/officeDocument/2006/relationships" xmlns:m="http://schemas.openxmlformats.org/officeDocument/2006/math" xmlns:v="urn:schemas-microsoft-com:vml" xmlns:wp14="http://schemas.microsoft.com/office/word/2010/wordprocessingDrawing" xmlns:wp="http://schemas.openxmlformats.org/drawingml/2006/wordprocessingDrawing" xmlns:w10="urn:schemas-microsoft-com:office:word" xmlns:w="http://schemas.openxmlformats.org/wordprocessingml/2006/main" xmlns:w14="http://schemas.microsoft.com/office/word/2010/wordml" xmlns:w15="http://schemas.microsoft.com/office/word/2012/wordml" xmlns:w16cex="http://schemas.microsoft.com/office/word/2018/wordml/cex" xmlns:w16cid="http://schemas.microsoft.com/office/word/2016/wordml/cid" xmlns:w16="http://schemas.microsoft.com/office/word/2018/wordml" xmlns:w16du="http://schemas.microsoft.com/office/word/2023/wordml/word16du" xmlns:w16sdtdh="http://schemas.microsoft.com/office/word/2020/wordml/sdtdatahash" xmlns:w16sdtfl="http://schemas.microsoft.com/office/word/2024/wordml/sdtformatlock" xmlns:w16se="http://schemas.microsoft.com/office/word/2015/wordml/symex" xmlns:wpg="http://schemas.microsoft.com/office/word/2010/wordprocessingGroup" xmlns:wpi="http://schemas.microsoft.com/office/word/2010/wordprocessingInk" xmlns:wne="http://schemas.microsoft.com/office/word/2006/wordml" xmlns:wps="http://schemas.microsoft.com/office/word/2010/wordprocessingShape" mc:Ignorable="w14 w15 w16se w16cid w16 w16cex w16sdtdh w16sdtfl w16du wp14">
+<w15:people xmlns:wpc="http://schemas.microsoft.com/office/word/2010/wordprocessingCanvas" xmlns:cx="http://schemas.microsoft.com/office/drawing/2014/chartex" xmlns:cx1="http://schemas.microsoft.com/office/drawing/2015/9/8/chartex" xmlns:cx2="http://schemas.microsoft.com/office/drawing/2015/10/21/chartex" xmlns:cx3="http://schemas.microsoft.com/office/drawing/2016/5/9/chartex" xmlns:cx4="http://schemas.microsoft.com/office/drawing/2016/5/10/chartex" xmlns:cx5="http://schemas.microsoft.com/office/drawing/2016/5/11/chartex" xmlns:cx6="http://schemas.microsoft.com/office/drawing/2016/5/12/chartex" xmlns:cx7="http://schemas.microsoft.com/office/drawing/2016/5/13/chartex" xmlns:cx8="http://schemas.microsoft.com/office/drawing/2016/5/14/chartex" xmlns:mc="http://schemas.openxmlformats.org/markup-compatibility/2006" xmlns:aink="http://schemas.microsoft.com/office/drawing/2016/ink" xmlns:am3d="http://schemas.microsoft.com/office/drawing/2017/model3d" xmlns:o="urn:schemas-microsoft-com:office:office" xmlns:oel="http://schemas.microsoft.com/office/2019/extlst" xmlns:r="http://schemas.openxmlformats.org/officeDocument/2006/relationships" xmlns:m="http://schemas.openxmlformats.org/officeDocument/2006/math" xmlns:v="urn:schemas-microsoft-com:vml" xmlns:wp14="http://schemas.microsoft.com/office/word/2010/wordprocessingDrawing" xmlns:wp="http://schemas.openxmlformats.org/drawingml/2006/wordprocessingDrawing" xmlns:w10="urn:schemas-microsoft-com:office:word" xmlns:w="http://schemas.openxmlformats.org/wordprocessingml/2006/main" xmlns:w14="http://schemas.microsoft.com/office/word/2010/wordml" xmlns:w15="http://schemas.microsoft.com/office/word/2012/wordml" xmlns:w16cei="http://schemas.microsoft.com/office/word/2026/wordml/cei" xmlns:w16cex="http://schemas.microsoft.com/office/word/2018/wordml/cex" xmlns:w16cid="http://schemas.microsoft.com/office/word/2016/wordml/cid" xmlns:w16="http://schemas.microsoft.com/office/word/2018/wordml" xmlns:w16du="http://schemas.microsoft.com/office/word/2023/wordml/word16du" xmlns:w16sdtdh="http://schemas.microsoft.com/office/word/2020/wordml/sdtdatahash" xmlns:w16sdtfl="http://schemas.microsoft.com/office/word/2024/wordml/sdtformatlock" xmlns:w16se="http://schemas.microsoft.com/office/word/2015/wordml/symex" xmlns:wpg="http://schemas.microsoft.com/office/word/2010/wordprocessingGroup" xmlns:wpi="http://schemas.microsoft.com/office/word/2010/wordprocessingInk" xmlns:wne="http://schemas.microsoft.com/office/word/2006/wordml" xmlns:wps="http://schemas.microsoft.com/office/word/2010/wordprocessingShape" mc:Ignorable="w14 w15 w16se w16cid w16 w16cex w16sdtdh w16sdtfl w16du wp14">
   <w15:person w15:author="Antonio Ortega">
     <w15:presenceInfo w15:providerId="AD" w15:userId="S::antonio.ortega@kuleuven.be::c6a747d7-790b-47e4-ae95-b117223a48b4"/>
   </w15:person>
@@ -947,7 +888,6 @@
   <w:style w:type="character" w:default="1" w:styleId="DefaultParagraphFont">
     <w:name w:val="Default Paragraph Font"/>
     <w:uiPriority w:val="1"/>
-    <w:semiHidden/>
     <w:unhideWhenUsed/>
   </w:style>
   <w:style w:type="table" w:default="1" w:styleId="TableNormal">

</xml_diff>